<commit_message>
Add medical-device channel venture and cross-border project to resume
Co-authored-by: nancyx461-art <nancyx461-art@users.noreply.github.com>
</commit_message>
<xml_diff>
--- a/resume/许增楠-医疗健康行业大客户销售-飞书.docx
+++ b/resume/许增楠-医疗健康行业大客户销售-飞书.docx
@@ -175,7 +175,7 @@
           <w:i w:val="0"/>
           <w:sz w:val="20"/>
         </w:rPr>
-        <w:t>医疗健康行业企业级客户销售经验：</w:t>
+        <w:t>医疗健康行业企业级客户销售与开拓经验：</w:t>
       </w:r>
       <w:r>
         <w:rPr>
@@ -184,7 +184,7 @@
           <w:i w:val="0"/>
           <w:sz w:val="20"/>
         </w:rPr>
-        <w:t>先后任职强生医疗、罗氏制药、视源医疗显示、辉瑞制药等医疗健康企业市场与销售端，覆盖医疗器械、制药、医疗 IT 硬件三大细分赛道及医疗机构、药企、器械企业三类目标客户；熟悉医院科室决策链与企业采购逻辑，具备从区域生意规划、重点客户开拓、渠道赋能到签单落地的全流程 B 端销售能力。</w:t>
+        <w:t>先后任职强生医疗、罗氏制药、视源医疗显示、辉瑞制药等医疗健康企业市场与销售端，现与前强生销售经理合伙经营医疗器械渠道业务，从 0 到 1 完成 4 家医院开发并实现多个产品入院，并操盘跨境医疗项目；覆盖医疗器械、制药、医药流通三大细分赛道及医疗机构、药企、渠道商三类目标客户，具备从区域生意规划、重点客户开拓、渠道赋能到签单落地的全流程 B 端销售能力。</w:t>
       </w:r>
     </w:p>
     <w:p>
@@ -289,7 +289,7 @@
           <w:i w:val="0"/>
           <w:sz w:val="20"/>
         </w:rPr>
-        <w:t>跨部门协作与大型项目落地：</w:t>
+        <w:t>高层关系、谈判与跨部门协作：</w:t>
       </w:r>
       <w:r>
         <w:rPr>
@@ -298,7 +298,7 @@
           <w:i w:val="0"/>
           <w:sz w:val="20"/>
         </w:rPr>
-        <w:t>在强生期间协同市场部、渠道伙伴与临床专家落地 10+ 场大型学术活动（单场规模最高 40 万元），参与白皮书、手术指南编写等行业内容项目；沟通协调能力强，可覆盖华南及港澳地区客户沟通。</w:t>
+        <w:t>既做过厂家一线销售，也以渠道商身份经营业务，熟悉医院、厂家、渠道商三方决策人的诉求与痛点，擅长与院方及渠道商老板对等洽谈；在强生期间协同市场部、渠道伙伴与临床专家落地 10+ 场大型学术活动（单场规模最高 40 万元），参与白皮书、手术指南编写等行业内容项目；可覆盖华南及港澳地区客户沟通。</w:t>
       </w:r>
     </w:p>
     <w:p>
@@ -318,6 +318,135 @@
           <w:sz w:val="25"/>
         </w:rPr>
         <w:t>工作经历</w:t>
+      </w:r>
+    </w:p>
+    <w:p>
+      <w:pPr>
+        <w:keepNext/>
+        <w:tabs>
+          <w:tab w:pos="9978" w:val="right"/>
+        </w:tabs>
+        <w:spacing w:before="80" w:after="20" w:line="276" w:lineRule="auto"/>
+      </w:pPr>
+      <w:r>
+        <w:rPr>
+          <w:rFonts w:ascii="Calibri" w:hAnsi="Calibri" w:eastAsia="微软雅黑"/>
+          <w:b/>
+          <w:i w:val="0"/>
+          <w:sz w:val="22"/>
+        </w:rPr>
+        <w:t>医疗器械渠道创业项目（与前强生销售经理合伙）</w:t>
+      </w:r>
+      <w:r>
+        <w:rPr>
+          <w:rFonts w:ascii="Calibri" w:hAnsi="Calibri" w:eastAsia="微软雅黑"/>
+          <w:b/>
+          <w:i w:val="0"/>
+          <w:color w:val="1F4E79"/>
+          <w:sz w:val="21"/>
+        </w:rPr>
+        <w:t xml:space="preserve">  |  联合创始人 / 合伙人</w:t>
+      </w:r>
+      <w:r>
+        <w:rPr>
+          <w:rFonts w:ascii="Calibri" w:hAnsi="Calibri" w:eastAsia="微软雅黑"/>
+          <w:b w:val="0"/>
+          <w:i w:val="0"/>
+          <w:color w:val="595959"/>
+          <w:sz w:val="19"/>
+        </w:rPr>
+        <w:tab/>
+        <w:t>2024 – 至今  |  广州</w:t>
+      </w:r>
+    </w:p>
+    <w:p>
+      <w:pPr>
+        <w:keepLines/>
+        <w:tabs>
+          <w:tab w:pos="255" w:val="left"/>
+        </w:tabs>
+        <w:spacing w:before="0" w:after="30" w:line="288" w:lineRule="auto"/>
+        <w:ind w:left="255" w:hanging="255"/>
+      </w:pPr>
+      <w:r>
+        <w:rPr>
+          <w:rFonts w:ascii="Calibri" w:hAnsi="Calibri" w:eastAsia="微软雅黑"/>
+          <w:b w:val="0"/>
+          <w:i w:val="0"/>
+          <w:color w:val="1F4E79"/>
+          <w:sz w:val="20"/>
+        </w:rPr>
+        <w:t>•</w:t>
+        <w:tab/>
+      </w:r>
+      <w:r>
+        <w:rPr>
+          <w:rFonts w:ascii="Calibri" w:hAnsi="Calibri" w:eastAsia="微软雅黑"/>
+          <w:b w:val="0"/>
+          <w:i w:val="0"/>
+          <w:sz w:val="20"/>
+        </w:rPr>
+        <w:t>医院开拓从 0 到 1：负责新医院的准入与开拓，完成 4 家医院开发并实现多个产品入院，打通院内准入、科室推广与持续放量的完整链路。</w:t>
+      </w:r>
+    </w:p>
+    <w:p>
+      <w:pPr>
+        <w:keepLines/>
+        <w:tabs>
+          <w:tab w:pos="255" w:val="left"/>
+        </w:tabs>
+        <w:spacing w:before="0" w:after="30" w:line="288" w:lineRule="auto"/>
+        <w:ind w:left="255" w:hanging="255"/>
+      </w:pPr>
+      <w:r>
+        <w:rPr>
+          <w:rFonts w:ascii="Calibri" w:hAnsi="Calibri" w:eastAsia="微软雅黑"/>
+          <w:b w:val="0"/>
+          <w:i w:val="0"/>
+          <w:color w:val="1F4E79"/>
+          <w:sz w:val="20"/>
+        </w:rPr>
+        <w:t>•</w:t>
+        <w:tab/>
+      </w:r>
+      <w:r>
+        <w:rPr>
+          <w:rFonts w:ascii="Calibri" w:hAnsi="Calibri" w:eastAsia="微软雅黑"/>
+          <w:b w:val="0"/>
+          <w:i w:val="0"/>
+          <w:sz w:val="20"/>
+        </w:rPr>
+        <w:t>渠道商视角：以医疗渠道商身份深度参与经营，熟悉渠道商老板在厂家合作、资金周转、院内关系、团队管理等方面的真实需求与痛点，具备与渠道商决策人对等沟通、共建合作方案的能力。</w:t>
+      </w:r>
+    </w:p>
+    <w:p>
+      <w:pPr>
+        <w:keepLines/>
+        <w:tabs>
+          <w:tab w:pos="255" w:val="left"/>
+        </w:tabs>
+        <w:spacing w:before="0" w:after="30" w:line="288" w:lineRule="auto"/>
+        <w:ind w:left="255" w:hanging="255"/>
+      </w:pPr>
+      <w:r>
+        <w:rPr>
+          <w:rFonts w:ascii="Calibri" w:hAnsi="Calibri" w:eastAsia="微软雅黑"/>
+          <w:b w:val="0"/>
+          <w:i w:val="0"/>
+          <w:color w:val="1F4E79"/>
+          <w:sz w:val="20"/>
+        </w:rPr>
+        <w:t>•</w:t>
+        <w:tab/>
+      </w:r>
+      <w:r>
+        <w:rPr>
+          <w:rFonts w:ascii="Calibri" w:hAnsi="Calibri" w:eastAsia="微软雅黑"/>
+          <w:b w:val="0"/>
+          <w:i w:val="0"/>
+          <w:sz w:val="20"/>
+        </w:rPr>
+        <w:t>跨境医疗项目操盘：牵头跨境医疗项目，带领团队与医院开展合作洽谈，与渠道商洽谈合作模式与分工，统筹项目推进节奏与各方资源。</w:t>
       </w:r>
     </w:p>
     <w:p>
@@ -361,7 +490,6 @@
     </w:p>
     <w:p>
       <w:pPr>
-        <w:keepNext/>
         <w:keepLines/>
         <w:tabs>
           <w:tab w:pos="255" w:val="left"/>
@@ -392,7 +520,6 @@
     </w:p>
     <w:p>
       <w:pPr>
-        <w:keepNext/>
         <w:keepLines/>
         <w:tabs>
           <w:tab w:pos="255" w:val="left"/>
@@ -419,36 +546,6 @@
           <w:sz w:val="20"/>
         </w:rPr>
         <w:t>主持校级科研课题《中医药内容营销对消费意愿的影响机制研究》，成果发表于《商场现代化》（2026，知网收录），聚焦医药行业数字化内容营销路径与客户转化机制。</w:t>
-      </w:r>
-    </w:p>
-    <w:p>
-      <w:pPr>
-        <w:keepLines/>
-        <w:tabs>
-          <w:tab w:pos="255" w:val="left"/>
-        </w:tabs>
-        <w:spacing w:before="0" w:after="30" w:line="288" w:lineRule="auto"/>
-        <w:ind w:left="255" w:hanging="255"/>
-      </w:pPr>
-      <w:r>
-        <w:rPr>
-          <w:rFonts w:ascii="Calibri" w:hAnsi="Calibri" w:eastAsia="微软雅黑"/>
-          <w:b w:val="0"/>
-          <w:i w:val="0"/>
-          <w:color w:val="1F4E79"/>
-          <w:sz w:val="20"/>
-        </w:rPr>
-        <w:t>•</w:t>
-        <w:tab/>
-      </w:r>
-      <w:r>
-        <w:rPr>
-          <w:rFonts w:ascii="Calibri" w:hAnsi="Calibri" w:eastAsia="微软雅黑"/>
-          <w:b w:val="0"/>
-          <w:i w:val="0"/>
-          <w:sz w:val="20"/>
-        </w:rPr>
-        <w:t>协助参与工商管理专业人才培养方案制订与规划；长期面向不同对象进行结构化表达与方案讲解。</w:t>
       </w:r>
     </w:p>
     <w:p>
@@ -492,7 +589,6 @@
     </w:p>
     <w:p>
       <w:pPr>
-        <w:keepNext/>
         <w:keepLines/>
         <w:tabs>
           <w:tab w:pos="255" w:val="left"/>
@@ -523,7 +619,6 @@
     </w:p>
     <w:p>
       <w:pPr>
-        <w:keepNext/>
         <w:keepLines/>
         <w:tabs>
           <w:tab w:pos="255" w:val="left"/>
@@ -554,7 +649,6 @@
     </w:p>
     <w:p>
       <w:pPr>
-        <w:keepNext/>
         <w:keepLines/>
         <w:tabs>
           <w:tab w:pos="255" w:val="left"/>
@@ -585,7 +679,6 @@
     </w:p>
     <w:p>
       <w:pPr>
-        <w:keepNext/>
         <w:keepLines/>
         <w:tabs>
           <w:tab w:pos="255" w:val="left"/>
@@ -685,7 +778,6 @@
     </w:p>
     <w:p>
       <w:pPr>
-        <w:keepNext/>
         <w:keepLines/>
         <w:tabs>
           <w:tab w:pos="255" w:val="left"/>
@@ -716,7 +808,6 @@
     </w:p>
     <w:p>
       <w:pPr>
-        <w:keepNext/>
         <w:keepLines/>
         <w:tabs>
           <w:tab w:pos="255" w:val="left"/>
@@ -816,7 +907,6 @@
     </w:p>
     <w:p>
       <w:pPr>
-        <w:keepNext/>
         <w:keepLines/>
         <w:tabs>
           <w:tab w:pos="255" w:val="left"/>
@@ -873,75 +963,6 @@
           <w:sz w:val="20"/>
         </w:rPr>
         <w:t>协助区域市场活动项目的策划、组织与落地，系统学习药企市场推广与客户管理方法。</w:t>
-      </w:r>
-    </w:p>
-    <w:p>
-      <w:pPr>
-        <w:keepNext/>
-        <w:tabs>
-          <w:tab w:pos="9978" w:val="right"/>
-        </w:tabs>
-        <w:spacing w:before="80" w:after="20" w:line="276" w:lineRule="auto"/>
-      </w:pPr>
-      <w:r>
-        <w:rPr>
-          <w:rFonts w:ascii="Calibri" w:hAnsi="Calibri" w:eastAsia="微软雅黑"/>
-          <w:b/>
-          <w:i w:val="0"/>
-          <w:sz w:val="22"/>
-        </w:rPr>
-        <w:t>广州市中大管理咨询有限公司 · 市场部</w:t>
-      </w:r>
-      <w:r>
-        <w:rPr>
-          <w:rFonts w:ascii="Calibri" w:hAnsi="Calibri" w:eastAsia="微软雅黑"/>
-          <w:b/>
-          <w:i w:val="0"/>
-          <w:color w:val="1F4E79"/>
-          <w:sz w:val="21"/>
-        </w:rPr>
-        <w:t xml:space="preserve">  |  市场分析实习生</w:t>
-      </w:r>
-      <w:r>
-        <w:rPr>
-          <w:rFonts w:ascii="Calibri" w:hAnsi="Calibri" w:eastAsia="微软雅黑"/>
-          <w:b w:val="0"/>
-          <w:i w:val="0"/>
-          <w:color w:val="595959"/>
-          <w:sz w:val="19"/>
-        </w:rPr>
-        <w:tab/>
-        <w:t>2018.10 – 2019.03  |  广州</w:t>
-      </w:r>
-    </w:p>
-    <w:p>
-      <w:pPr>
-        <w:keepLines/>
-        <w:tabs>
-          <w:tab w:pos="255" w:val="left"/>
-        </w:tabs>
-        <w:spacing w:before="0" w:after="30" w:line="288" w:lineRule="auto"/>
-        <w:ind w:left="255" w:hanging="255"/>
-      </w:pPr>
-      <w:r>
-        <w:rPr>
-          <w:rFonts w:ascii="Calibri" w:hAnsi="Calibri" w:eastAsia="微软雅黑"/>
-          <w:b w:val="0"/>
-          <w:i w:val="0"/>
-          <w:color w:val="1F4E79"/>
-          <w:sz w:val="20"/>
-        </w:rPr>
-        <w:t>•</w:t>
-        <w:tab/>
-      </w:r>
-      <w:r>
-        <w:rPr>
-          <w:rFonts w:ascii="Calibri" w:hAnsi="Calibri" w:eastAsia="微软雅黑"/>
-          <w:b w:val="0"/>
-          <w:i w:val="0"/>
-          <w:sz w:val="20"/>
-        </w:rPr>
-        <w:t>参与“粤港澳大湾区人才创新发展大会”政府项目执行（物料组组长）；追踪行业与竞争对手动态，撰写峰会领导主持稿、致辞稿及管理咨询科普文章。</w:t>
       </w:r>
     </w:p>
     <w:p>
@@ -1004,7 +1025,6 @@
     </w:p>
     <w:p>
       <w:pPr>
-        <w:keepNext/>
         <w:keepLines/>
         <w:tabs>
           <w:tab w:pos="255" w:val="left"/>
@@ -1035,7 +1055,6 @@
     </w:p>
     <w:p>
       <w:pPr>
-        <w:keepNext/>
         <w:keepLines/>
         <w:tabs>
           <w:tab w:pos="255" w:val="left"/>
@@ -1481,44 +1500,6 @@
         <w:t>英语（CET-6、BEC 中级）、粤语（良好）、普通话。</w:t>
       </w:r>
     </w:p>
-    <w:p>
-      <w:pPr>
-        <w:tabs>
-          <w:tab w:pos="255" w:val="left"/>
-        </w:tabs>
-        <w:spacing w:before="0" w:after="30" w:line="288" w:lineRule="auto"/>
-        <w:ind w:left="255" w:hanging="255"/>
-      </w:pPr>
-      <w:r>
-        <w:rPr>
-          <w:rFonts w:ascii="Calibri" w:hAnsi="Calibri" w:eastAsia="微软雅黑"/>
-          <w:b w:val="0"/>
-          <w:i w:val="0"/>
-          <w:color w:val="1F4E79"/>
-          <w:sz w:val="20"/>
-        </w:rPr>
-        <w:t>•</w:t>
-        <w:tab/>
-      </w:r>
-      <w:r>
-        <w:rPr>
-          <w:rFonts w:ascii="Calibri" w:hAnsi="Calibri" w:eastAsia="微软雅黑"/>
-          <w:b/>
-          <w:i w:val="0"/>
-          <w:sz w:val="20"/>
-        </w:rPr>
-        <w:t>个人特质：</w:t>
-      </w:r>
-      <w:r>
-        <w:rPr>
-          <w:rFonts w:ascii="Calibri" w:hAnsi="Calibri" w:eastAsia="微软雅黑"/>
-          <w:b w:val="0"/>
-          <w:i w:val="0"/>
-          <w:sz w:val="20"/>
-        </w:rPr>
-        <w:t>学习能力强、勤奋有韧劲、对结果负责；习惯主动复盘不足并持续改进。</w:t>
-      </w:r>
-    </w:p>
     <w:sectPr>
       <w:pgSz w:w="11906" w:h="16838"/>
       <w:pgMar w:top="794" w:right="964" w:bottom="737" w:left="964" w:header="720" w:footer="720" w:gutter="0"/>

</xml_diff>

<commit_message>
Move education section to the top of the resume
Co-authored-by: nancyx461-art <nancyx461-art@users.noreply.github.com>
</commit_message>
<xml_diff>
--- a/resume/许增楠-医疗健康行业大客户销售-飞书.docx
+++ b/resume/许增楠-医疗健康行业大客户销售-飞书.docx
@@ -129,6 +129,163 @@
           <w:bottom w:val="single" w:sz="12" w:space="1" w:color="1F4E79"/>
         </w:pBdr>
       </w:pPr>
+    </w:p>
+    <w:p>
+      <w:pPr>
+        <w:spacing w:before="160" w:after="60" w:line="276" w:lineRule="auto"/>
+        <w:keepNext/>
+        <w:pBdr>
+          <w:bottom w:val="single" w:sz="8" w:space="1" w:color="1F4E79"/>
+        </w:pBdr>
+      </w:pPr>
+      <w:r>
+        <w:rPr>
+          <w:rFonts w:ascii="Calibri" w:hAnsi="Calibri" w:eastAsia="微软雅黑"/>
+          <w:b/>
+          <w:i w:val="0"/>
+          <w:color w:val="1F4E79"/>
+          <w:sz w:val="25"/>
+        </w:rPr>
+        <w:t>教育背景</w:t>
+      </w:r>
+    </w:p>
+    <w:p>
+      <w:pPr>
+        <w:keepNext/>
+        <w:tabs>
+          <w:tab w:pos="9978" w:val="right"/>
+        </w:tabs>
+        <w:spacing w:before="80" w:after="20" w:line="276" w:lineRule="auto"/>
+      </w:pPr>
+      <w:r>
+        <w:rPr>
+          <w:rFonts w:ascii="Calibri" w:hAnsi="Calibri" w:eastAsia="微软雅黑"/>
+          <w:b/>
+          <w:i w:val="0"/>
+          <w:sz w:val="22"/>
+        </w:rPr>
+        <w:t>广东外语外贸大学</w:t>
+      </w:r>
+      <w:r>
+        <w:rPr>
+          <w:rFonts w:ascii="Calibri" w:hAnsi="Calibri" w:eastAsia="微软雅黑"/>
+          <w:b/>
+          <w:i w:val="0"/>
+          <w:color w:val="1F4E79"/>
+          <w:sz w:val="21"/>
+        </w:rPr>
+        <w:t xml:space="preserve">  |  企业管理 · 硕士</w:t>
+      </w:r>
+      <w:r>
+        <w:rPr>
+          <w:rFonts w:ascii="Calibri" w:hAnsi="Calibri" w:eastAsia="微软雅黑"/>
+          <w:b w:val="0"/>
+          <w:i w:val="0"/>
+          <w:color w:val="595959"/>
+          <w:sz w:val="19"/>
+        </w:rPr>
+        <w:tab/>
+        <w:t>2019.08 – 2022.06  |  广州</w:t>
+      </w:r>
+    </w:p>
+    <w:p>
+      <w:pPr>
+        <w:keepLines/>
+        <w:tabs>
+          <w:tab w:pos="255" w:val="left"/>
+        </w:tabs>
+        <w:spacing w:before="0" w:after="30" w:line="288" w:lineRule="auto"/>
+        <w:ind w:left="255" w:hanging="255"/>
+      </w:pPr>
+      <w:r>
+        <w:rPr>
+          <w:rFonts w:ascii="Calibri" w:hAnsi="Calibri" w:eastAsia="微软雅黑"/>
+          <w:b w:val="0"/>
+          <w:i w:val="0"/>
+          <w:color w:val="1F4E79"/>
+          <w:sz w:val="20"/>
+        </w:rPr>
+        <w:t>•</w:t>
+        <w:tab/>
+      </w:r>
+      <w:r>
+        <w:rPr>
+          <w:rFonts w:ascii="Calibri" w:hAnsi="Calibri" w:eastAsia="微软雅黑"/>
+          <w:b w:val="0"/>
+          <w:i w:val="0"/>
+          <w:sz w:val="20"/>
+        </w:rPr>
+        <w:t>研究方向：市场营销（品牌营销、医药营销）；连续三年获校级奖学金（一等 2 次、二等 1 次）。</w:t>
+      </w:r>
+    </w:p>
+    <w:p>
+      <w:pPr>
+        <w:keepNext/>
+        <w:tabs>
+          <w:tab w:pos="9978" w:val="right"/>
+        </w:tabs>
+        <w:spacing w:before="80" w:after="20" w:line="276" w:lineRule="auto"/>
+      </w:pPr>
+      <w:r>
+        <w:rPr>
+          <w:rFonts w:ascii="Calibri" w:hAnsi="Calibri" w:eastAsia="微软雅黑"/>
+          <w:b/>
+          <w:i w:val="0"/>
+          <w:sz w:val="22"/>
+        </w:rPr>
+        <w:t>广州中医药大学</w:t>
+      </w:r>
+      <w:r>
+        <w:rPr>
+          <w:rFonts w:ascii="Calibri" w:hAnsi="Calibri" w:eastAsia="微软雅黑"/>
+          <w:b/>
+          <w:i w:val="0"/>
+          <w:color w:val="1F4E79"/>
+          <w:sz w:val="21"/>
+        </w:rPr>
+        <w:t xml:space="preserve">  |  国际经济与贸易（医药方向） · 本科</w:t>
+      </w:r>
+      <w:r>
+        <w:rPr>
+          <w:rFonts w:ascii="Calibri" w:hAnsi="Calibri" w:eastAsia="微软雅黑"/>
+          <w:b w:val="0"/>
+          <w:i w:val="0"/>
+          <w:color w:val="595959"/>
+          <w:sz w:val="19"/>
+        </w:rPr>
+        <w:tab/>
+        <w:t>2015.09 – 2019.06  |  广州</w:t>
+      </w:r>
+    </w:p>
+    <w:p>
+      <w:pPr>
+        <w:keepLines/>
+        <w:tabs>
+          <w:tab w:pos="255" w:val="left"/>
+        </w:tabs>
+        <w:spacing w:before="0" w:after="30" w:line="288" w:lineRule="auto"/>
+        <w:ind w:left="255" w:hanging="255"/>
+      </w:pPr>
+      <w:r>
+        <w:rPr>
+          <w:rFonts w:ascii="Calibri" w:hAnsi="Calibri" w:eastAsia="微软雅黑"/>
+          <w:b w:val="0"/>
+          <w:i w:val="0"/>
+          <w:color w:val="1F4E79"/>
+          <w:sz w:val="20"/>
+        </w:rPr>
+        <w:t>•</w:t>
+        <w:tab/>
+      </w:r>
+      <w:r>
+        <w:rPr>
+          <w:rFonts w:ascii="Calibri" w:hAnsi="Calibri" w:eastAsia="微软雅黑"/>
+          <w:b w:val="0"/>
+          <w:i w:val="0"/>
+          <w:sz w:val="20"/>
+        </w:rPr>
+        <w:t>GPA 3.8（专业排名第 2）；修读《药理学》《西医学概论》等医药课程；连续四年获校级奖学金。</w:t>
+      </w:r>
     </w:p>
     <w:p>
       <w:pPr>
@@ -1264,163 +1421,6 @@
           <w:color w:val="1F4E79"/>
           <w:sz w:val="25"/>
         </w:rPr>
-        <w:t>教育背景</w:t>
-      </w:r>
-    </w:p>
-    <w:p>
-      <w:pPr>
-        <w:keepNext/>
-        <w:tabs>
-          <w:tab w:pos="9978" w:val="right"/>
-        </w:tabs>
-        <w:spacing w:before="80" w:after="20" w:line="276" w:lineRule="auto"/>
-      </w:pPr>
-      <w:r>
-        <w:rPr>
-          <w:rFonts w:ascii="Calibri" w:hAnsi="Calibri" w:eastAsia="微软雅黑"/>
-          <w:b/>
-          <w:i w:val="0"/>
-          <w:sz w:val="22"/>
-        </w:rPr>
-        <w:t>广东外语外贸大学</w:t>
-      </w:r>
-      <w:r>
-        <w:rPr>
-          <w:rFonts w:ascii="Calibri" w:hAnsi="Calibri" w:eastAsia="微软雅黑"/>
-          <w:b/>
-          <w:i w:val="0"/>
-          <w:color w:val="1F4E79"/>
-          <w:sz w:val="21"/>
-        </w:rPr>
-        <w:t xml:space="preserve">  |  企业管理 · 硕士</w:t>
-      </w:r>
-      <w:r>
-        <w:rPr>
-          <w:rFonts w:ascii="Calibri" w:hAnsi="Calibri" w:eastAsia="微软雅黑"/>
-          <w:b w:val="0"/>
-          <w:i w:val="0"/>
-          <w:color w:val="595959"/>
-          <w:sz w:val="19"/>
-        </w:rPr>
-        <w:tab/>
-        <w:t>2019.08 – 2022.06  |  广州</w:t>
-      </w:r>
-    </w:p>
-    <w:p>
-      <w:pPr>
-        <w:keepLines/>
-        <w:tabs>
-          <w:tab w:pos="255" w:val="left"/>
-        </w:tabs>
-        <w:spacing w:before="0" w:after="30" w:line="288" w:lineRule="auto"/>
-        <w:ind w:left="255" w:hanging="255"/>
-      </w:pPr>
-      <w:r>
-        <w:rPr>
-          <w:rFonts w:ascii="Calibri" w:hAnsi="Calibri" w:eastAsia="微软雅黑"/>
-          <w:b w:val="0"/>
-          <w:i w:val="0"/>
-          <w:color w:val="1F4E79"/>
-          <w:sz w:val="20"/>
-        </w:rPr>
-        <w:t>•</w:t>
-        <w:tab/>
-      </w:r>
-      <w:r>
-        <w:rPr>
-          <w:rFonts w:ascii="Calibri" w:hAnsi="Calibri" w:eastAsia="微软雅黑"/>
-          <w:b w:val="0"/>
-          <w:i w:val="0"/>
-          <w:sz w:val="20"/>
-        </w:rPr>
-        <w:t>研究方向：市场营销（品牌营销、医药营销）；连续三年获校级奖学金（一等 2 次、二等 1 次）。</w:t>
-      </w:r>
-    </w:p>
-    <w:p>
-      <w:pPr>
-        <w:keepNext/>
-        <w:tabs>
-          <w:tab w:pos="9978" w:val="right"/>
-        </w:tabs>
-        <w:spacing w:before="80" w:after="20" w:line="276" w:lineRule="auto"/>
-      </w:pPr>
-      <w:r>
-        <w:rPr>
-          <w:rFonts w:ascii="Calibri" w:hAnsi="Calibri" w:eastAsia="微软雅黑"/>
-          <w:b/>
-          <w:i w:val="0"/>
-          <w:sz w:val="22"/>
-        </w:rPr>
-        <w:t>广州中医药大学</w:t>
-      </w:r>
-      <w:r>
-        <w:rPr>
-          <w:rFonts w:ascii="Calibri" w:hAnsi="Calibri" w:eastAsia="微软雅黑"/>
-          <w:b/>
-          <w:i w:val="0"/>
-          <w:color w:val="1F4E79"/>
-          <w:sz w:val="21"/>
-        </w:rPr>
-        <w:t xml:space="preserve">  |  国际经济与贸易（医药方向） · 本科</w:t>
-      </w:r>
-      <w:r>
-        <w:rPr>
-          <w:rFonts w:ascii="Calibri" w:hAnsi="Calibri" w:eastAsia="微软雅黑"/>
-          <w:b w:val="0"/>
-          <w:i w:val="0"/>
-          <w:color w:val="595959"/>
-          <w:sz w:val="19"/>
-        </w:rPr>
-        <w:tab/>
-        <w:t>2015.09 – 2019.06  |  广州</w:t>
-      </w:r>
-    </w:p>
-    <w:p>
-      <w:pPr>
-        <w:keepLines/>
-        <w:tabs>
-          <w:tab w:pos="255" w:val="left"/>
-        </w:tabs>
-        <w:spacing w:before="0" w:after="30" w:line="288" w:lineRule="auto"/>
-        <w:ind w:left="255" w:hanging="255"/>
-      </w:pPr>
-      <w:r>
-        <w:rPr>
-          <w:rFonts w:ascii="Calibri" w:hAnsi="Calibri" w:eastAsia="微软雅黑"/>
-          <w:b w:val="0"/>
-          <w:i w:val="0"/>
-          <w:color w:val="1F4E79"/>
-          <w:sz w:val="20"/>
-        </w:rPr>
-        <w:t>•</w:t>
-        <w:tab/>
-      </w:r>
-      <w:r>
-        <w:rPr>
-          <w:rFonts w:ascii="Calibri" w:hAnsi="Calibri" w:eastAsia="微软雅黑"/>
-          <w:b w:val="0"/>
-          <w:i w:val="0"/>
-          <w:sz w:val="20"/>
-        </w:rPr>
-        <w:t>GPA 3.8（专业排名第 2）；修读《药理学》《西医学概论》等医药课程；连续四年获校级奖学金。</w:t>
-      </w:r>
-    </w:p>
-    <w:p>
-      <w:pPr>
-        <w:spacing w:before="160" w:after="60" w:line="276" w:lineRule="auto"/>
-        <w:keepNext/>
-        <w:pBdr>
-          <w:bottom w:val="single" w:sz="8" w:space="1" w:color="1F4E79"/>
-        </w:pBdr>
-      </w:pPr>
-      <w:r>
-        <w:rPr>
-          <w:rFonts w:ascii="Calibri" w:hAnsi="Calibri" w:eastAsia="微软雅黑"/>
-          <w:b/>
-          <w:i w:val="0"/>
-          <w:color w:val="1F4E79"/>
-          <w:sz w:val="25"/>
-        </w:rPr>
         <w:t>技能与语言</w:t>
       </w:r>
     </w:p>

</xml_diff>

<commit_message>
Quantify venture results: 8 products, 4 private hospitals, 5 distributors, VP/dept-head contacts
Co-authored-by: nancyx461-art <nancyx461-art@users.noreply.github.com>
</commit_message>
<xml_diff>
--- a/resume/许增楠-医疗健康行业大客户销售-飞书.docx
+++ b/resume/许增楠-医疗健康行业大客户销售-飞书.docx
@@ -341,7 +341,7 @@
           <w:i w:val="0"/>
           <w:sz w:val="20"/>
         </w:rPr>
-        <w:t>先后任职强生医疗、罗氏制药、视源医疗显示、辉瑞制药等医疗健康企业市场与销售端，现与前强生销售经理合伙经营医疗器械渠道业务，从 0 到 1 完成 4 家医院开发并实现多个产品入院，并操盘跨境医疗项目；覆盖医疗器械、制药、医药流通三大细分赛道及医疗机构、药企、渠道商三类目标客户，具备从区域生意规划、重点客户开拓、渠道赋能到签单落地的全流程 B 端销售能力。</w:t>
+        <w:t>先后任职强生医疗、罗氏制药、视源医疗显示、辉瑞制药等医疗健康企业市场与销售端，现与前强生销售经理合伙经营医疗器械渠道业务，从 0 到 1 完成 4 家医院开发、8 个产品入院，并操盘跨境医疗项目（洽谈 4 家私立医院、合作 5 家渠道商）；覆盖医疗器械、制药、医药流通三大细分赛道及医疗机构、药企、渠道商三类目标客户，具备从区域生意规划、重点客户开拓、渠道赋能到签单落地的全流程 B 端销售能力。</w:t>
       </w:r>
     </w:p>
     <w:p>
@@ -455,7 +455,7 @@
           <w:i w:val="0"/>
           <w:sz w:val="20"/>
         </w:rPr>
-        <w:t>既做过厂家一线销售，也以渠道商身份经营业务，熟悉医院、厂家、渠道商三方决策人的诉求与痛点，擅长与院方及渠道商老板对等洽谈；在强生期间协同市场部、渠道伙伴与临床专家落地 10+ 场大型学术活动（单场规模最高 40 万元），参与白皮书、手术指南编写等行业内容项目；可覆盖华南及港澳地区客户沟通。</w:t>
+        <w:t>既做过厂家一线销售，也以渠道商身份经营业务，熟悉医院、厂家、渠道商三方决策人的诉求与痛点，具备与副院长、科主任及渠道商老板直接对等洽谈的经验；在强生期间协同市场部、渠道伙伴与临床专家落地 10+ 场大型学术活动（单场规模最高 40 万元），参与白皮书、手术指南编写等行业内容项目；可覆盖华南及港澳地区客户沟通。</w:t>
       </w:r>
     </w:p>
     <w:p>
@@ -543,7 +543,7 @@
           <w:i w:val="0"/>
           <w:sz w:val="20"/>
         </w:rPr>
-        <w:t>医院开拓从 0 到 1：负责新医院的准入与开拓，完成 4 家医院开发并实现多个产品入院，打通院内准入、科室推广与持续放量的完整链路。</w:t>
+        <w:t>医院开拓从 0 到 1：负责新医院的准入与开拓，直接对接副院长、科主任等院方决策人，完成 4 家医院开发、8 个产品入院，打通院内准入、科室推广与持续放量的完整链路。</w:t>
       </w:r>
     </w:p>
     <w:p>
@@ -603,7 +603,7 @@
           <w:i w:val="0"/>
           <w:sz w:val="20"/>
         </w:rPr>
-        <w:t>跨境医疗项目操盘：牵头跨境医疗项目，带领团队与医院开展合作洽谈，与渠道商洽谈合作模式与分工，统筹项目推进节奏与各方资源。</w:t>
+        <w:t>跨境医疗项目操盘：牵头跨境医疗项目，带领团队完成 4 家私立医院的合作洽谈，建立 5 家合作渠道商并确定合作模式与分工，统筹项目推进节奏与各方资源。</w:t>
       </w:r>
     </w:p>
     <w:p>

</xml_diff>

<commit_message>
Add AI tool proficiency (Claude, Codex, Cursor, WorkBuddy) to skills and core strengths
Co-authored-by: nancyx461-art <nancyx461-art@users.noreply.github.com>
</commit_message>
<xml_diff>
--- a/resume/许增楠-医疗健康行业大客户销售-飞书.docx
+++ b/resume/许增楠-医疗健康行业大客户销售-飞书.docx
@@ -417,7 +417,7 @@
           <w:i w:val="0"/>
           <w:sz w:val="20"/>
         </w:rPr>
-        <w:t>研究方向为数字营销、AI 营销、医药营销，持续跟踪医疗大健康行业数字化转型、组织协同与营销技术趋势，能够把协同办公 / SaaS / AI 产品价值与制药、器械、医疗机构客户的业务场景结合，输出行业解决方案思路。</w:t>
+        <w:t>研究方向为数字营销、AI 营销、医药营销，持续跟踪医疗大健康行业数字化转型、组织协同与营销技术趋势；本人是 Claude、Codex、Cursor、WorkBuddy 等 AI 工具的深度使用者，熟悉 AI Agent 在研究、方案与办公场景中的实际价值，能够把协同办公 / SaaS / AI 产品价值与制药、器械、医疗机构客户的业务场景结合，输出行业解决方案思路。</w:t>
       </w:r>
     </w:p>
     <w:p>
@@ -1119,7 +1119,7 @@
           <w:i w:val="0"/>
           <w:sz w:val="20"/>
         </w:rPr>
-        <w:t>协助区域市场活动项目的策划、组织与落地，系统学习药企市场推广与客户管理方法。</w:t>
+        <w:t>协助区域市场活动项目的策划、组织与落地。</w:t>
       </w:r>
     </w:p>
     <w:p>
@@ -1450,6 +1450,44 @@
           <w:i w:val="0"/>
           <w:sz w:val="20"/>
         </w:rPr>
+        <w:t>AI 工具：</w:t>
+      </w:r>
+      <w:r>
+        <w:rPr>
+          <w:rFonts w:ascii="Calibri" w:hAnsi="Calibri" w:eastAsia="微软雅黑"/>
+          <w:b w:val="0"/>
+          <w:i w:val="0"/>
+          <w:sz w:val="20"/>
+        </w:rPr>
+        <w:t>熟练使用 Claude、OpenAI Codex、Cursor、WorkBuddy 等 AI 助手与 Agent 工具，日常用于行业研究与客户洞察、销售方案与行业解决方案撰写、数据分析及办公自动化提效；持续关注 AI 在企业服务场景的落地方式。</w:t>
+      </w:r>
+    </w:p>
+    <w:p>
+      <w:pPr>
+        <w:tabs>
+          <w:tab w:pos="255" w:val="left"/>
+        </w:tabs>
+        <w:spacing w:before="0" w:after="30" w:line="288" w:lineRule="auto"/>
+        <w:ind w:left="255" w:hanging="255"/>
+      </w:pPr>
+      <w:r>
+        <w:rPr>
+          <w:rFonts w:ascii="Calibri" w:hAnsi="Calibri" w:eastAsia="微软雅黑"/>
+          <w:b w:val="0"/>
+          <w:i w:val="0"/>
+          <w:color w:val="1F4E79"/>
+          <w:sz w:val="20"/>
+        </w:rPr>
+        <w:t>•</w:t>
+        <w:tab/>
+      </w:r>
+      <w:r>
+        <w:rPr>
+          <w:rFonts w:ascii="Calibri" w:hAnsi="Calibri" w:eastAsia="微软雅黑"/>
+          <w:b/>
+          <w:i w:val="0"/>
+          <w:sz w:val="20"/>
+        </w:rPr>
         <w:t>办公与分析工具：</w:t>
       </w:r>
       <w:r>
@@ -1497,12 +1535,12 @@
           <w:i w:val="0"/>
           <w:sz w:val="20"/>
         </w:rPr>
-        <w:t>英语（CET-6、BEC 中级）、粤语（良好）、普通话。</w:t>
+        <w:t>英语（CET-6、BEC 中级）、粤语（良好）。</w:t>
       </w:r>
     </w:p>
     <w:sectPr>
       <w:pgSz w:w="11906" w:h="16838"/>
-      <w:pgMar w:top="794" w:right="964" w:bottom="737" w:left="964" w:header="720" w:footer="720" w:gutter="0"/>
+      <w:pgMar w:top="794" w:right="964" w:bottom="680" w:left="964" w:header="720" w:footer="720" w:gutter="0"/>
       <w:cols w:space="720"/>
       <w:docGrid w:linePitch="360"/>
     </w:sectPr>

</xml_diff>

<commit_message>
Redesign resume layout, tone down overstated claims, reframe venture as part-time with stability statement
Co-authored-by: nancyx461-art <nancyx461-art@users.noreply.github.com>
</commit_message>
<xml_diff>
--- a/resume/许增楠-医疗健康行业大客户销售-飞书.docx
+++ b/resume/许增楠-医疗健康行业大客户销售-飞书.docx
@@ -2,121 +2,127 @@
 <file path=word/document.xml><?xml version="1.0" encoding="utf-8"?>
 <w:document xmlns:wpc="http://schemas.microsoft.com/office/word/2010/wordprocessingCanvas" xmlns:mo="http://schemas.microsoft.com/office/mac/office/2008/main" xmlns:mc="http://schemas.openxmlformats.org/markup-compatibility/2006" xmlns:mv="urn:schemas-microsoft-com:mac:vml" xmlns:o="urn:schemas-microsoft-com:office:office" xmlns:r="http://schemas.openxmlformats.org/officeDocument/2006/relationships" xmlns:m="http://schemas.openxmlformats.org/officeDocument/2006/math" xmlns:v="urn:schemas-microsoft-com:vml" xmlns:wp14="http://schemas.microsoft.com/office/word/2010/wordprocessingDrawing" xmlns:wp="http://schemas.openxmlformats.org/drawingml/2006/wordprocessingDrawing" xmlns:w10="urn:schemas-microsoft-com:office:word" xmlns:w="http://schemas.openxmlformats.org/wordprocessingml/2006/main" xmlns:w14="http://schemas.microsoft.com/office/word/2010/wordml" xmlns:wpg="http://schemas.microsoft.com/office/word/2010/wordprocessingGroup" xmlns:wpi="http://schemas.microsoft.com/office/word/2010/wordprocessingInk" xmlns:wne="http://schemas.microsoft.com/office/word/2006/wordml" xmlns:wps="http://schemas.microsoft.com/office/word/2010/wordprocessingShape" mc:Ignorable="w14 wp14">
   <w:body>
-    <w:p>
-      <w:pPr>
-        <w:spacing w:before="0" w:after="0" w:line="240" w:lineRule="auto"/>
-      </w:pPr>
-      <w:r>
-        <w:rPr>
-          <w:rFonts w:ascii="Calibri" w:hAnsi="Calibri" w:eastAsia="微软雅黑"/>
-          <w:b/>
-          <w:i w:val="0"/>
-          <w:color w:val="1F4E79"/>
-          <w:sz w:val="44"/>
-        </w:rPr>
-        <w:t>许增楠</w:t>
-      </w:r>
-      <w:r>
-        <w:rPr>
-          <w:rFonts w:ascii="Calibri" w:hAnsi="Calibri" w:eastAsia="微软雅黑"/>
-          <w:b/>
-          <w:i w:val="0"/>
-          <w:sz w:val="21"/>
-        </w:rPr>
-        <w:t xml:space="preserve">    求职意向：医疗健康行业-大客户销售（飞书）｜意向城市：深圳 / 广州</w:t>
-      </w:r>
-    </w:p>
     <w:tbl>
       <w:tblPr>
         <w:tblW w:type="auto" w:w="0"/>
         <w:jc w:val="left"/>
-        <w:tblLayout w:type="autofit"/>
+        <w:tblLayout w:type="fixed"/>
         <w:tblLook w:firstColumn="1" w:firstRow="1" w:lastColumn="0" w:lastRow="0" w:noHBand="0" w:noVBand="1" w:val="04A0"/>
       </w:tblPr>
       <w:tblGrid>
-        <w:gridCol w:w="4989"/>
-        <w:gridCol w:w="4989"/>
+        <w:gridCol w:w="4876"/>
+        <w:gridCol w:w="4876"/>
       </w:tblGrid>
       <w:tr>
         <w:tc>
           <w:tcPr>
-            <w:tcW w:type="dxa" w:w="4989"/>
+            <w:tcW w:type="dxa" w:w="5656"/>
           </w:tcPr>
           <w:p>
             <w:pPr>
-              <w:spacing w:after="0" w:before="20"/>
+              <w:spacing w:after="40"/>
+            </w:pPr>
+            <w:r>
+              <w:rPr>
+                <w:rFonts w:ascii="Calibri" w:hAnsi="Calibri" w:eastAsia="微软雅黑"/>
+                <w:b/>
+                <w:color w:val="2B4A6F"/>
+                <w:sz w:val="48"/>
+              </w:rPr>
+              <w:t>许增楠</w:t>
+            </w:r>
+          </w:p>
+          <w:p>
+            <w:pPr>
+              <w:spacing w:after="0"/>
+            </w:pPr>
+            <w:r>
+              <w:rPr>
+                <w:rFonts w:ascii="Calibri" w:hAnsi="Calibri" w:eastAsia="微软雅黑"/>
+                <w:b/>
+                <w:color w:val="262626"/>
+                <w:sz w:val="21"/>
+              </w:rPr>
+              <w:t>求职意向：医疗健康行业-大客户销售</w:t>
+            </w:r>
+          </w:p>
+          <w:p>
+            <w:pPr>
+              <w:spacing w:after="0"/>
             </w:pPr>
             <w:r>
               <w:rPr>
                 <w:rFonts w:ascii="Calibri" w:hAnsi="Calibri" w:eastAsia="微软雅黑"/>
                 <w:b w:val="0"/>
-                <w:i w:val="0"/>
-                <w:color w:val="595959"/>
+                <w:color w:val="6B6B6B"/>
                 <w:sz w:val="19"/>
               </w:rPr>
-              <w:t>手机：15626104764</w:t>
+              <w:t>意向城市：深圳 / 广州</w:t>
             </w:r>
           </w:p>
         </w:tc>
         <w:tc>
           <w:tcPr>
-            <w:tcW w:type="dxa" w:w="4989"/>
+            <w:tcW w:type="dxa" w:w="4096"/>
           </w:tcPr>
           <w:p>
             <w:pPr>
-              <w:spacing w:after="0" w:before="20"/>
+              <w:spacing w:after="0" w:before="0" w:line="276" w:lineRule="auto"/>
+              <w:jc w:val="right"/>
             </w:pPr>
             <w:r>
               <w:rPr>
                 <w:rFonts w:ascii="Calibri" w:hAnsi="Calibri" w:eastAsia="微软雅黑"/>
                 <w:b w:val="0"/>
-                <w:i w:val="0"/>
-                <w:color w:val="595959"/>
-                <w:sz w:val="19"/>
+                <w:color w:val="6B6B6B"/>
+                <w:sz w:val="18"/>
               </w:rPr>
-              <w:t>邮箱：15626104764@163.com</w:t>
+              <w:t>15626104764</w:t>
             </w:r>
           </w:p>
-        </w:tc>
-      </w:tr>
-      <w:tr>
-        <w:tc>
-          <w:tcPr>
-            <w:tcW w:type="dxa" w:w="4989"/>
-          </w:tcPr>
           <w:p>
             <w:pPr>
-              <w:spacing w:after="0" w:before="20"/>
+              <w:spacing w:after="0" w:before="0" w:line="276" w:lineRule="auto"/>
+              <w:jc w:val="right"/>
             </w:pPr>
             <w:r>
               <w:rPr>
                 <w:rFonts w:ascii="Calibri" w:hAnsi="Calibri" w:eastAsia="微软雅黑"/>
                 <w:b w:val="0"/>
-                <w:i w:val="0"/>
-                <w:color w:val="595959"/>
-                <w:sz w:val="19"/>
+                <w:color w:val="6B6B6B"/>
+                <w:sz w:val="18"/>
               </w:rPr>
-              <w:t>企业管理硕士（市场营销 / 医药营销方向）</w:t>
+              <w:t>15626104764@163.com</w:t>
             </w:r>
           </w:p>
-        </w:tc>
-        <w:tc>
-          <w:tcPr>
-            <w:tcW w:type="dxa" w:w="4989"/>
-          </w:tcPr>
           <w:p>
             <w:pPr>
-              <w:spacing w:after="0" w:before="20"/>
+              <w:spacing w:after="0" w:before="0" w:line="276" w:lineRule="auto"/>
+              <w:jc w:val="right"/>
             </w:pPr>
             <w:r>
               <w:rPr>
                 <w:rFonts w:ascii="Calibri" w:hAnsi="Calibri" w:eastAsia="微软雅黑"/>
                 <w:b w:val="0"/>
-                <w:i w:val="0"/>
-                <w:color w:val="595959"/>
-                <w:sz w:val="19"/>
+                <w:color w:val="6B6B6B"/>
+                <w:sz w:val="18"/>
               </w:rPr>
-              <w:t>英语 CET-6、BEC 中级｜粤语良好</w:t>
+              <w:t>企业管理硕士 · 市场营销方向</w:t>
+            </w:r>
+          </w:p>
+          <w:p>
+            <w:pPr>
+              <w:spacing w:after="0" w:before="0" w:line="276" w:lineRule="auto"/>
+              <w:jc w:val="right"/>
+            </w:pPr>
+            <w:r>
+              <w:rPr>
+                <w:rFonts w:ascii="Calibri" w:hAnsi="Calibri" w:eastAsia="微软雅黑"/>
+                <w:b w:val="0"/>
+                <w:color w:val="6B6B6B"/>
+                <w:sz w:val="18"/>
+              </w:rPr>
+              <w:t>英语 CET-6 / BEC 中级 · 粤语</w:t>
             </w:r>
           </w:p>
         </w:tc>
@@ -124,27 +130,26 @@
     </w:tbl>
     <w:p>
       <w:pPr>
-        <w:spacing w:before="40" w:after="0" w:line="240" w:lineRule="auto"/>
+        <w:spacing w:before="80" w:after="0" w:line="240" w:lineRule="auto"/>
         <w:pBdr>
-          <w:bottom w:val="single" w:sz="12" w:space="1" w:color="1F4E79"/>
+          <w:bottom w:val="single" w:sz="10" w:space="1" w:color="2B4A6F"/>
         </w:pBdr>
       </w:pPr>
     </w:p>
     <w:p>
       <w:pPr>
-        <w:spacing w:before="160" w:after="60" w:line="276" w:lineRule="auto"/>
+        <w:spacing w:before="240" w:after="100" w:line="240" w:lineRule="auto"/>
         <w:keepNext/>
         <w:pBdr>
-          <w:bottom w:val="single" w:sz="8" w:space="1" w:color="1F4E79"/>
+          <w:bottom w:val="single" w:sz="6" w:space="3" w:color="C9D3DE"/>
         </w:pBdr>
       </w:pPr>
       <w:r>
         <w:rPr>
           <w:rFonts w:ascii="Calibri" w:hAnsi="Calibri" w:eastAsia="微软雅黑"/>
           <w:b/>
-          <w:i w:val="0"/>
-          <w:color w:val="1F4E79"/>
-          <w:sz w:val="25"/>
+          <w:color w:val="2B4A6F"/>
+          <w:sz w:val="23"/>
         </w:rPr>
         <w:t>教育背景</w:t>
       </w:r>
@@ -153,1156 +158,53 @@
       <w:pPr>
         <w:keepNext/>
         <w:tabs>
-          <w:tab w:pos="9978" w:val="right"/>
+          <w:tab w:pos="9752" w:val="right"/>
         </w:tabs>
-        <w:spacing w:before="80" w:after="20" w:line="276" w:lineRule="auto"/>
+        <w:spacing w:before="140" w:after="40" w:line="264" w:lineRule="auto"/>
       </w:pPr>
       <w:r>
         <w:rPr>
           <w:rFonts w:ascii="Calibri" w:hAnsi="Calibri" w:eastAsia="微软雅黑"/>
           <w:b/>
-          <w:i w:val="0"/>
-          <w:sz w:val="22"/>
+          <w:color w:val="262626"/>
+          <w:sz w:val="21"/>
         </w:rPr>
         <w:t>广东外语外贸大学</w:t>
       </w:r>
       <w:r>
         <w:rPr>
           <w:rFonts w:ascii="Calibri" w:hAnsi="Calibri" w:eastAsia="微软雅黑"/>
-          <w:b/>
-          <w:i w:val="0"/>
-          <w:color w:val="1F4E79"/>
-          <w:sz w:val="21"/>
+          <w:b w:val="0"/>
+          <w:color w:val="6B6B6B"/>
+          <w:sz w:val="19"/>
         </w:rPr>
-        <w:t xml:space="preserve">  |  企业管理 · 硕士</w:t>
+        <w:t xml:space="preserve">　企业管理 · 硕士</w:t>
       </w:r>
       <w:r>
         <w:rPr>
           <w:rFonts w:ascii="Calibri" w:hAnsi="Calibri" w:eastAsia="微软雅黑"/>
           <w:b w:val="0"/>
-          <w:i w:val="0"/>
-          <w:color w:val="595959"/>
-          <w:sz w:val="19"/>
+          <w:color w:val="6B6B6B"/>
+          <w:sz w:val="18"/>
         </w:rPr>
         <w:tab/>
-        <w:t>2019.08 – 2022.06  |  广州</w:t>
+        <w:t>2019.08 – 2022.06　广州</w:t>
       </w:r>
     </w:p>
     <w:p>
       <w:pPr>
         <w:keepLines/>
         <w:tabs>
-          <w:tab w:pos="255" w:val="left"/>
+          <w:tab w:pos="227" w:val="left"/>
         </w:tabs>
-        <w:spacing w:before="0" w:after="30" w:line="288" w:lineRule="auto"/>
-        <w:ind w:left="255" w:hanging="255"/>
+        <w:spacing w:before="0" w:after="60" w:line="312" w:lineRule="auto"/>
+        <w:ind w:left="227" w:hanging="227"/>
       </w:pPr>
       <w:r>
         <w:rPr>
           <w:rFonts w:ascii="Calibri" w:hAnsi="Calibri" w:eastAsia="微软雅黑"/>
           <w:b w:val="0"/>
-          <w:i w:val="0"/>
-          <w:color w:val="1F4E79"/>
-          <w:sz w:val="20"/>
-        </w:rPr>
-        <w:t>•</w:t>
-        <w:tab/>
-      </w:r>
-      <w:r>
-        <w:rPr>
-          <w:rFonts w:ascii="Calibri" w:hAnsi="Calibri" w:eastAsia="微软雅黑"/>
-          <w:b w:val="0"/>
-          <w:i w:val="0"/>
-          <w:sz w:val="20"/>
-        </w:rPr>
-        <w:t>研究方向：市场营销（品牌营销、医药营销）；连续三年获校级奖学金（一等 2 次、二等 1 次）。</w:t>
-      </w:r>
-    </w:p>
-    <w:p>
-      <w:pPr>
-        <w:keepNext/>
-        <w:tabs>
-          <w:tab w:pos="9978" w:val="right"/>
-        </w:tabs>
-        <w:spacing w:before="80" w:after="20" w:line="276" w:lineRule="auto"/>
-      </w:pPr>
-      <w:r>
-        <w:rPr>
-          <w:rFonts w:ascii="Calibri" w:hAnsi="Calibri" w:eastAsia="微软雅黑"/>
-          <w:b/>
-          <w:i w:val="0"/>
-          <w:sz w:val="22"/>
-        </w:rPr>
-        <w:t>广州中医药大学</w:t>
-      </w:r>
-      <w:r>
-        <w:rPr>
-          <w:rFonts w:ascii="Calibri" w:hAnsi="Calibri" w:eastAsia="微软雅黑"/>
-          <w:b/>
-          <w:i w:val="0"/>
-          <w:color w:val="1F4E79"/>
-          <w:sz w:val="21"/>
-        </w:rPr>
-        <w:t xml:space="preserve">  |  国际经济与贸易（医药方向） · 本科</w:t>
-      </w:r>
-      <w:r>
-        <w:rPr>
-          <w:rFonts w:ascii="Calibri" w:hAnsi="Calibri" w:eastAsia="微软雅黑"/>
-          <w:b w:val="0"/>
-          <w:i w:val="0"/>
-          <w:color w:val="595959"/>
-          <w:sz w:val="19"/>
-        </w:rPr>
-        <w:tab/>
-        <w:t>2015.09 – 2019.06  |  广州</w:t>
-      </w:r>
-    </w:p>
-    <w:p>
-      <w:pPr>
-        <w:keepLines/>
-        <w:tabs>
-          <w:tab w:pos="255" w:val="left"/>
-        </w:tabs>
-        <w:spacing w:before="0" w:after="30" w:line="288" w:lineRule="auto"/>
-        <w:ind w:left="255" w:hanging="255"/>
-      </w:pPr>
-      <w:r>
-        <w:rPr>
-          <w:rFonts w:ascii="Calibri" w:hAnsi="Calibri" w:eastAsia="微软雅黑"/>
-          <w:b w:val="0"/>
-          <w:i w:val="0"/>
-          <w:color w:val="1F4E79"/>
-          <w:sz w:val="20"/>
-        </w:rPr>
-        <w:t>•</w:t>
-        <w:tab/>
-      </w:r>
-      <w:r>
-        <w:rPr>
-          <w:rFonts w:ascii="Calibri" w:hAnsi="Calibri" w:eastAsia="微软雅黑"/>
-          <w:b w:val="0"/>
-          <w:i w:val="0"/>
-          <w:sz w:val="20"/>
-        </w:rPr>
-        <w:t>GPA 3.8（专业排名第 2）；修读《药理学》《西医学概论》等医药课程；连续四年获校级奖学金。</w:t>
-      </w:r>
-    </w:p>
-    <w:p>
-      <w:pPr>
-        <w:spacing w:before="160" w:after="60" w:line="276" w:lineRule="auto"/>
-        <w:keepNext/>
-        <w:pBdr>
-          <w:bottom w:val="single" w:sz="8" w:space="1" w:color="1F4E79"/>
-        </w:pBdr>
-      </w:pPr>
-      <w:r>
-        <w:rPr>
-          <w:rFonts w:ascii="Calibri" w:hAnsi="Calibri" w:eastAsia="微软雅黑"/>
-          <w:b/>
-          <w:i w:val="0"/>
-          <w:color w:val="1F4E79"/>
-          <w:sz w:val="25"/>
-        </w:rPr>
-        <w:t>核心优势</w:t>
-      </w:r>
-    </w:p>
-    <w:p>
-      <w:pPr>
-        <w:tabs>
-          <w:tab w:pos="255" w:val="left"/>
-        </w:tabs>
-        <w:spacing w:before="0" w:after="30" w:line="288" w:lineRule="auto"/>
-        <w:ind w:left="255" w:hanging="255"/>
-      </w:pPr>
-      <w:r>
-        <w:rPr>
-          <w:rFonts w:ascii="Calibri" w:hAnsi="Calibri" w:eastAsia="微软雅黑"/>
-          <w:b w:val="0"/>
-          <w:i w:val="0"/>
-          <w:color w:val="1F4E79"/>
-          <w:sz w:val="20"/>
-        </w:rPr>
-        <w:t>•</w:t>
-        <w:tab/>
-      </w:r>
-      <w:r>
-        <w:rPr>
-          <w:rFonts w:ascii="Calibri" w:hAnsi="Calibri" w:eastAsia="微软雅黑"/>
-          <w:b/>
-          <w:i w:val="0"/>
-          <w:sz w:val="20"/>
-        </w:rPr>
-        <w:t>医疗健康行业企业级客户销售与开拓经验：</w:t>
-      </w:r>
-      <w:r>
-        <w:rPr>
-          <w:rFonts w:ascii="Calibri" w:hAnsi="Calibri" w:eastAsia="微软雅黑"/>
-          <w:b w:val="0"/>
-          <w:i w:val="0"/>
-          <w:sz w:val="20"/>
-        </w:rPr>
-        <w:t>先后任职强生医疗、罗氏制药、视源医疗显示、辉瑞制药等医疗健康企业市场与销售端，现与前强生销售经理合伙经营医疗器械渠道业务，从 0 到 1 完成 4 家医院开发、8 个产品入院，并操盘跨境医疗项目（洽谈 4 家私立医院、合作 5 家渠道商）；覆盖医疗器械、制药、医药流通三大细分赛道及医疗机构、药企、渠道商三类目标客户，具备从区域生意规划、重点客户开拓、渠道赋能到签单落地的全流程 B 端销售能力。</w:t>
-      </w:r>
-    </w:p>
-    <w:p>
-      <w:pPr>
-        <w:tabs>
-          <w:tab w:pos="255" w:val="left"/>
-        </w:tabs>
-        <w:spacing w:before="0" w:after="30" w:line="288" w:lineRule="auto"/>
-        <w:ind w:left="255" w:hanging="255"/>
-      </w:pPr>
-      <w:r>
-        <w:rPr>
-          <w:rFonts w:ascii="Calibri" w:hAnsi="Calibri" w:eastAsia="微软雅黑"/>
-          <w:b w:val="0"/>
-          <w:i w:val="0"/>
-          <w:color w:val="1F4E79"/>
-          <w:sz w:val="20"/>
-        </w:rPr>
-        <w:t>•</w:t>
-        <w:tab/>
-      </w:r>
-      <w:r>
-        <w:rPr>
-          <w:rFonts w:ascii="Calibri" w:hAnsi="Calibri" w:eastAsia="微软雅黑"/>
-          <w:b/>
-          <w:i w:val="0"/>
-          <w:sz w:val="20"/>
-        </w:rPr>
-        <w:t>行业分析与解决方案讲解能力：</w:t>
-      </w:r>
-      <w:r>
-        <w:rPr>
-          <w:rFonts w:ascii="Calibri" w:hAnsi="Calibri" w:eastAsia="微软雅黑"/>
-          <w:b w:val="0"/>
-          <w:i w:val="0"/>
-          <w:sz w:val="20"/>
-        </w:rPr>
-        <w:t>企业管理硕士（医药营销方向），现任高校市场营销专任教师，主讲《数字营销》《营销渠道管理》等课程；主持中医药内容营销课题并在知网收录期刊发表成果，能够独立完成行业研究、形成策略洞察，并面向客户与专家完成结构化方案讲解（曾负责产品卫星会、科室会及学术活动宣讲）。</w:t>
-      </w:r>
-    </w:p>
-    <w:p>
-      <w:pPr>
-        <w:tabs>
-          <w:tab w:pos="255" w:val="left"/>
-        </w:tabs>
-        <w:spacing w:before="0" w:after="30" w:line="288" w:lineRule="auto"/>
-        <w:ind w:left="255" w:hanging="255"/>
-      </w:pPr>
-      <w:r>
-        <w:rPr>
-          <w:rFonts w:ascii="Calibri" w:hAnsi="Calibri" w:eastAsia="微软雅黑"/>
-          <w:b w:val="0"/>
-          <w:i w:val="0"/>
-          <w:color w:val="1F4E79"/>
-          <w:sz w:val="20"/>
-        </w:rPr>
-        <w:t>•</w:t>
-        <w:tab/>
-      </w:r>
-      <w:r>
-        <w:rPr>
-          <w:rFonts w:ascii="Calibri" w:hAnsi="Calibri" w:eastAsia="微软雅黑"/>
-          <w:b/>
-          <w:i w:val="0"/>
-          <w:sz w:val="20"/>
-        </w:rPr>
-        <w:t>数字化与 AI 营销视角：</w:t>
-      </w:r>
-      <w:r>
-        <w:rPr>
-          <w:rFonts w:ascii="Calibri" w:hAnsi="Calibri" w:eastAsia="微软雅黑"/>
-          <w:b w:val="0"/>
-          <w:i w:val="0"/>
-          <w:sz w:val="20"/>
-        </w:rPr>
-        <w:t>研究方向为数字营销、AI 营销、医药营销，持续跟踪医疗大健康行业数字化转型、组织协同与营销技术趋势；本人是 Claude、Codex、Cursor、WorkBuddy 等 AI 工具的深度使用者，熟悉 AI Agent 在研究、方案与办公场景中的实际价值，能够把协同办公 / SaaS / AI 产品价值与制药、器械、医疗机构客户的业务场景结合，输出行业解决方案思路。</w:t>
-      </w:r>
-    </w:p>
-    <w:p>
-      <w:pPr>
-        <w:tabs>
-          <w:tab w:pos="255" w:val="left"/>
-        </w:tabs>
-        <w:spacing w:before="0" w:after="30" w:line="288" w:lineRule="auto"/>
-        <w:ind w:left="255" w:hanging="255"/>
-      </w:pPr>
-      <w:r>
-        <w:rPr>
-          <w:rFonts w:ascii="Calibri" w:hAnsi="Calibri" w:eastAsia="微软雅黑"/>
-          <w:b w:val="0"/>
-          <w:i w:val="0"/>
-          <w:color w:val="1F4E79"/>
-          <w:sz w:val="20"/>
-        </w:rPr>
-        <w:t>•</w:t>
-        <w:tab/>
-      </w:r>
-      <w:r>
-        <w:rPr>
-          <w:rFonts w:ascii="Calibri" w:hAnsi="Calibri" w:eastAsia="微软雅黑"/>
-          <w:b/>
-          <w:i w:val="0"/>
-          <w:sz w:val="20"/>
-        </w:rPr>
-        <w:t>高层关系、谈判与跨部门协作：</w:t>
-      </w:r>
-      <w:r>
-        <w:rPr>
-          <w:rFonts w:ascii="Calibri" w:hAnsi="Calibri" w:eastAsia="微软雅黑"/>
-          <w:b w:val="0"/>
-          <w:i w:val="0"/>
-          <w:sz w:val="20"/>
-        </w:rPr>
-        <w:t>既做过厂家一线销售，也以渠道商身份经营业务，熟悉医院、厂家、渠道商三方决策人的诉求与痛点，具备与副院长、科主任及渠道商老板直接对等洽谈的经验；在强生期间协同市场部、渠道伙伴与临床专家落地 10+ 场大型学术活动（单场规模最高 40 万元），参与白皮书、手术指南编写等行业内容项目；可覆盖华南及港澳地区客户沟通。</w:t>
-      </w:r>
-    </w:p>
-    <w:p>
-      <w:pPr>
-        <w:spacing w:before="160" w:after="60" w:line="276" w:lineRule="auto"/>
-        <w:keepNext/>
-        <w:pBdr>
-          <w:bottom w:val="single" w:sz="8" w:space="1" w:color="1F4E79"/>
-        </w:pBdr>
-      </w:pPr>
-      <w:r>
-        <w:rPr>
-          <w:rFonts w:ascii="Calibri" w:hAnsi="Calibri" w:eastAsia="微软雅黑"/>
-          <w:b/>
-          <w:i w:val="0"/>
-          <w:color w:val="1F4E79"/>
-          <w:sz w:val="25"/>
-        </w:rPr>
-        <w:t>工作经历</w:t>
-      </w:r>
-    </w:p>
-    <w:p>
-      <w:pPr>
-        <w:keepNext/>
-        <w:tabs>
-          <w:tab w:pos="9978" w:val="right"/>
-        </w:tabs>
-        <w:spacing w:before="80" w:after="20" w:line="276" w:lineRule="auto"/>
-      </w:pPr>
-      <w:r>
-        <w:rPr>
-          <w:rFonts w:ascii="Calibri" w:hAnsi="Calibri" w:eastAsia="微软雅黑"/>
-          <w:b/>
-          <w:i w:val="0"/>
-          <w:sz w:val="22"/>
-        </w:rPr>
-        <w:t>医疗器械渠道创业项目（与前强生销售经理合伙）</w:t>
-      </w:r>
-      <w:r>
-        <w:rPr>
-          <w:rFonts w:ascii="Calibri" w:hAnsi="Calibri" w:eastAsia="微软雅黑"/>
-          <w:b/>
-          <w:i w:val="0"/>
-          <w:color w:val="1F4E79"/>
-          <w:sz w:val="21"/>
-        </w:rPr>
-        <w:t xml:space="preserve">  |  联合创始人 / 合伙人</w:t>
-      </w:r>
-      <w:r>
-        <w:rPr>
-          <w:rFonts w:ascii="Calibri" w:hAnsi="Calibri" w:eastAsia="微软雅黑"/>
-          <w:b w:val="0"/>
-          <w:i w:val="0"/>
-          <w:color w:val="595959"/>
-          <w:sz w:val="19"/>
-        </w:rPr>
-        <w:tab/>
-        <w:t>2024 – 至今  |  广州</w:t>
-      </w:r>
-    </w:p>
-    <w:p>
-      <w:pPr>
-        <w:keepLines/>
-        <w:tabs>
-          <w:tab w:pos="255" w:val="left"/>
-        </w:tabs>
-        <w:spacing w:before="0" w:after="30" w:line="288" w:lineRule="auto"/>
-        <w:ind w:left="255" w:hanging="255"/>
-      </w:pPr>
-      <w:r>
-        <w:rPr>
-          <w:rFonts w:ascii="Calibri" w:hAnsi="Calibri" w:eastAsia="微软雅黑"/>
-          <w:b w:val="0"/>
-          <w:i w:val="0"/>
-          <w:color w:val="1F4E79"/>
-          <w:sz w:val="20"/>
-        </w:rPr>
-        <w:t>•</w:t>
-        <w:tab/>
-      </w:r>
-      <w:r>
-        <w:rPr>
-          <w:rFonts w:ascii="Calibri" w:hAnsi="Calibri" w:eastAsia="微软雅黑"/>
-          <w:b w:val="0"/>
-          <w:i w:val="0"/>
-          <w:sz w:val="20"/>
-        </w:rPr>
-        <w:t>医院开拓从 0 到 1：负责新医院的准入与开拓，直接对接副院长、科主任等院方决策人，完成 4 家医院开发、8 个产品入院，打通院内准入、科室推广与持续放量的完整链路。</w:t>
-      </w:r>
-    </w:p>
-    <w:p>
-      <w:pPr>
-        <w:keepLines/>
-        <w:tabs>
-          <w:tab w:pos="255" w:val="left"/>
-        </w:tabs>
-        <w:spacing w:before="0" w:after="30" w:line="288" w:lineRule="auto"/>
-        <w:ind w:left="255" w:hanging="255"/>
-      </w:pPr>
-      <w:r>
-        <w:rPr>
-          <w:rFonts w:ascii="Calibri" w:hAnsi="Calibri" w:eastAsia="微软雅黑"/>
-          <w:b w:val="0"/>
-          <w:i w:val="0"/>
-          <w:color w:val="1F4E79"/>
-          <w:sz w:val="20"/>
-        </w:rPr>
-        <w:t>•</w:t>
-        <w:tab/>
-      </w:r>
-      <w:r>
-        <w:rPr>
-          <w:rFonts w:ascii="Calibri" w:hAnsi="Calibri" w:eastAsia="微软雅黑"/>
-          <w:b w:val="0"/>
-          <w:i w:val="0"/>
-          <w:sz w:val="20"/>
-        </w:rPr>
-        <w:t>渠道商视角：以医疗渠道商身份深度参与经营，熟悉渠道商老板在厂家合作、资金周转、院内关系、团队管理等方面的真实需求与痛点，具备与渠道商决策人对等沟通、共建合作方案的能力。</w:t>
-      </w:r>
-    </w:p>
-    <w:p>
-      <w:pPr>
-        <w:keepLines/>
-        <w:tabs>
-          <w:tab w:pos="255" w:val="left"/>
-        </w:tabs>
-        <w:spacing w:before="0" w:after="30" w:line="288" w:lineRule="auto"/>
-        <w:ind w:left="255" w:hanging="255"/>
-      </w:pPr>
-      <w:r>
-        <w:rPr>
-          <w:rFonts w:ascii="Calibri" w:hAnsi="Calibri" w:eastAsia="微软雅黑"/>
-          <w:b w:val="0"/>
-          <w:i w:val="0"/>
-          <w:color w:val="1F4E79"/>
-          <w:sz w:val="20"/>
-        </w:rPr>
-        <w:t>•</w:t>
-        <w:tab/>
-      </w:r>
-      <w:r>
-        <w:rPr>
-          <w:rFonts w:ascii="Calibri" w:hAnsi="Calibri" w:eastAsia="微软雅黑"/>
-          <w:b w:val="0"/>
-          <w:i w:val="0"/>
-          <w:sz w:val="20"/>
-        </w:rPr>
-        <w:t>跨境医疗项目操盘：牵头跨境医疗项目，带领团队完成 4 家私立医院的合作洽谈，建立 5 家合作渠道商并确定合作模式与分工，统筹项目推进节奏与各方资源。</w:t>
-      </w:r>
-    </w:p>
-    <w:p>
-      <w:pPr>
-        <w:keepNext/>
-        <w:tabs>
-          <w:tab w:pos="9978" w:val="right"/>
-        </w:tabs>
-        <w:spacing w:before="80" w:after="20" w:line="276" w:lineRule="auto"/>
-      </w:pPr>
-      <w:r>
-        <w:rPr>
-          <w:rFonts w:ascii="Calibri" w:hAnsi="Calibri" w:eastAsia="微软雅黑"/>
-          <w:b/>
-          <w:i w:val="0"/>
-          <w:sz w:val="22"/>
-        </w:rPr>
-        <w:t>广州南方学院 · 商学院</w:t>
-      </w:r>
-      <w:r>
-        <w:rPr>
-          <w:rFonts w:ascii="Calibri" w:hAnsi="Calibri" w:eastAsia="微软雅黑"/>
-          <w:b/>
-          <w:i w:val="0"/>
-          <w:color w:val="1F4E79"/>
-          <w:sz w:val="21"/>
-        </w:rPr>
-        <w:t xml:space="preserve">  |  市场营销专任教师</w:t>
-      </w:r>
-      <w:r>
-        <w:rPr>
-          <w:rFonts w:ascii="Calibri" w:hAnsi="Calibri" w:eastAsia="微软雅黑"/>
-          <w:b w:val="0"/>
-          <w:i w:val="0"/>
-          <w:color w:val="595959"/>
-          <w:sz w:val="19"/>
-        </w:rPr>
-        <w:tab/>
-        <w:t>2024.02 – 至今  |  广州</w:t>
-      </w:r>
-    </w:p>
-    <w:p>
-      <w:pPr>
-        <w:keepLines/>
-        <w:tabs>
-          <w:tab w:pos="255" w:val="left"/>
-        </w:tabs>
-        <w:spacing w:before="0" w:after="30" w:line="288" w:lineRule="auto"/>
-        <w:ind w:left="255" w:hanging="255"/>
-      </w:pPr>
-      <w:r>
-        <w:rPr>
-          <w:rFonts w:ascii="Calibri" w:hAnsi="Calibri" w:eastAsia="微软雅黑"/>
-          <w:b w:val="0"/>
-          <w:i w:val="0"/>
-          <w:color w:val="1F4E79"/>
-          <w:sz w:val="20"/>
-        </w:rPr>
-        <w:t>•</w:t>
-        <w:tab/>
-      </w:r>
-      <w:r>
-        <w:rPr>
-          <w:rFonts w:ascii="Calibri" w:hAnsi="Calibri" w:eastAsia="微软雅黑"/>
-          <w:b w:val="0"/>
-          <w:i w:val="0"/>
-          <w:sz w:val="20"/>
-        </w:rPr>
-        <w:t>主讲《数字营销》《营销渠道管理》《电子商务原理》等课程，系统梳理 B 端营销、渠道管理与数字化转型方法论，持续产出面向医疗健康行业的营销策略研究。</w:t>
-      </w:r>
-    </w:p>
-    <w:p>
-      <w:pPr>
-        <w:keepLines/>
-        <w:tabs>
-          <w:tab w:pos="255" w:val="left"/>
-        </w:tabs>
-        <w:spacing w:before="0" w:after="30" w:line="288" w:lineRule="auto"/>
-        <w:ind w:left="255" w:hanging="255"/>
-      </w:pPr>
-      <w:r>
-        <w:rPr>
-          <w:rFonts w:ascii="Calibri" w:hAnsi="Calibri" w:eastAsia="微软雅黑"/>
-          <w:b w:val="0"/>
-          <w:i w:val="0"/>
-          <w:color w:val="1F4E79"/>
-          <w:sz w:val="20"/>
-        </w:rPr>
-        <w:t>•</w:t>
-        <w:tab/>
-      </w:r>
-      <w:r>
-        <w:rPr>
-          <w:rFonts w:ascii="Calibri" w:hAnsi="Calibri" w:eastAsia="微软雅黑"/>
-          <w:b w:val="0"/>
-          <w:i w:val="0"/>
-          <w:sz w:val="20"/>
-        </w:rPr>
-        <w:t>主持校级科研课题《中医药内容营销对消费意愿的影响机制研究》，成果发表于《商场现代化》（2026，知网收录），聚焦医药行业数字化内容营销路径与客户转化机制。</w:t>
-      </w:r>
-    </w:p>
-    <w:p>
-      <w:pPr>
-        <w:keepNext/>
-        <w:tabs>
-          <w:tab w:pos="9978" w:val="right"/>
-        </w:tabs>
-        <w:spacing w:before="80" w:after="20" w:line="276" w:lineRule="auto"/>
-      </w:pPr>
-      <w:r>
-        <w:rPr>
-          <w:rFonts w:ascii="Calibri" w:hAnsi="Calibri" w:eastAsia="微软雅黑"/>
-          <w:b/>
-          <w:i w:val="0"/>
-          <w:sz w:val="22"/>
-        </w:rPr>
-        <w:t>强生（上海）医疗器材有限公司 · 能量外科与微创外科</w:t>
-      </w:r>
-      <w:r>
-        <w:rPr>
-          <w:rFonts w:ascii="Calibri" w:hAnsi="Calibri" w:eastAsia="微软雅黑"/>
-          <w:b/>
-          <w:i w:val="0"/>
-          <w:color w:val="1F4E79"/>
-          <w:sz w:val="21"/>
-        </w:rPr>
-        <w:t xml:space="preserve">  |  销售培训生</w:t>
-      </w:r>
-      <w:r>
-        <w:rPr>
-          <w:rFonts w:ascii="Calibri" w:hAnsi="Calibri" w:eastAsia="微软雅黑"/>
-          <w:b w:val="0"/>
-          <w:i w:val="0"/>
-          <w:color w:val="595959"/>
-          <w:sz w:val="19"/>
-        </w:rPr>
-        <w:tab/>
-        <w:t>2022.07 – 2024.01  |  广州</w:t>
-      </w:r>
-    </w:p>
-    <w:p>
-      <w:pPr>
-        <w:keepLines/>
-        <w:tabs>
-          <w:tab w:pos="255" w:val="left"/>
-        </w:tabs>
-        <w:spacing w:before="0" w:after="30" w:line="288" w:lineRule="auto"/>
-        <w:ind w:left="255" w:hanging="255"/>
-      </w:pPr>
-      <w:r>
-        <w:rPr>
-          <w:rFonts w:ascii="Calibri" w:hAnsi="Calibri" w:eastAsia="微软雅黑"/>
-          <w:b w:val="0"/>
-          <w:i w:val="0"/>
-          <w:color w:val="1F4E79"/>
-          <w:sz w:val="20"/>
-        </w:rPr>
-        <w:t>•</w:t>
-        <w:tab/>
-      </w:r>
-      <w:r>
-        <w:rPr>
-          <w:rFonts w:ascii="Calibri" w:hAnsi="Calibri" w:eastAsia="微软雅黑"/>
-          <w:b w:val="0"/>
-          <w:i w:val="0"/>
-          <w:sz w:val="20"/>
-        </w:rPr>
-        <w:t>区域生意规划：基于业绩目标收集市场与竞品信息，完成区域市场分析、生意规划及销售策略制定与落地，业绩指标超额达成。</w:t>
-      </w:r>
-    </w:p>
-    <w:p>
-      <w:pPr>
-        <w:keepLines/>
-        <w:tabs>
-          <w:tab w:pos="255" w:val="left"/>
-        </w:tabs>
-        <w:spacing w:before="0" w:after="30" w:line="288" w:lineRule="auto"/>
-        <w:ind w:left="255" w:hanging="255"/>
-      </w:pPr>
-      <w:r>
-        <w:rPr>
-          <w:rFonts w:ascii="Calibri" w:hAnsi="Calibri" w:eastAsia="微软雅黑"/>
-          <w:b w:val="0"/>
-          <w:i w:val="0"/>
-          <w:color w:val="1F4E79"/>
-          <w:sz w:val="20"/>
-        </w:rPr>
-        <w:t>•</w:t>
-        <w:tab/>
-      </w:r>
-      <w:r>
-        <w:rPr>
-          <w:rFonts w:ascii="Calibri" w:hAnsi="Calibri" w:eastAsia="微软雅黑"/>
-          <w:b w:val="0"/>
-          <w:i w:val="0"/>
-          <w:sz w:val="20"/>
-        </w:rPr>
-        <w:t>重点客户开拓与维护：持续拜访核心客户及关键决策人，洞察客户痛点并提供针对性解决方案，传递产品与品牌价值，建立长期稳定的客户关系。</w:t>
-      </w:r>
-    </w:p>
-    <w:p>
-      <w:pPr>
-        <w:keepLines/>
-        <w:tabs>
-          <w:tab w:pos="255" w:val="left"/>
-        </w:tabs>
-        <w:spacing w:before="0" w:after="30" w:line="288" w:lineRule="auto"/>
-        <w:ind w:left="255" w:hanging="255"/>
-      </w:pPr>
-      <w:r>
-        <w:rPr>
-          <w:rFonts w:ascii="Calibri" w:hAnsi="Calibri" w:eastAsia="微软雅黑"/>
-          <w:b w:val="0"/>
-          <w:i w:val="0"/>
-          <w:color w:val="1F4E79"/>
-          <w:sz w:val="20"/>
-        </w:rPr>
-        <w:t>•</w:t>
-        <w:tab/>
-      </w:r>
-      <w:r>
-        <w:rPr>
-          <w:rFonts w:ascii="Calibri" w:hAnsi="Calibri" w:eastAsia="微软雅黑"/>
-          <w:b w:val="0"/>
-          <w:i w:val="0"/>
-          <w:sz w:val="20"/>
-        </w:rPr>
-        <w:t>渠道管理与赋能：协助经销商制定行动目标与计划，负责渠道人员产品知识培训，协同拜访重点客户，定期盘点渠道业绩并给予指导。</w:t>
-      </w:r>
-    </w:p>
-    <w:p>
-      <w:pPr>
-        <w:keepLines/>
-        <w:tabs>
-          <w:tab w:pos="255" w:val="left"/>
-        </w:tabs>
-        <w:spacing w:before="0" w:after="30" w:line="288" w:lineRule="auto"/>
-        <w:ind w:left="255" w:hanging="255"/>
-      </w:pPr>
-      <w:r>
-        <w:rPr>
-          <w:rFonts w:ascii="Calibri" w:hAnsi="Calibri" w:eastAsia="微软雅黑"/>
-          <w:b w:val="0"/>
-          <w:i w:val="0"/>
-          <w:color w:val="1F4E79"/>
-          <w:sz w:val="20"/>
-        </w:rPr>
-        <w:t>•</w:t>
-        <w:tab/>
-      </w:r>
-      <w:r>
-        <w:rPr>
-          <w:rFonts w:ascii="Calibri" w:hAnsi="Calibri" w:eastAsia="微软雅黑"/>
-          <w:b w:val="0"/>
-          <w:i w:val="0"/>
-          <w:sz w:val="20"/>
-        </w:rPr>
-        <w:t>学术活动与行业内容：围绕客户需求策划并全程落地 10+ 场大型学术活动（含全国性活动，单场规模最高 40 万元）；与市场部协同推进白皮书、手术指南编写及社交媒体科普等项目在区域落地。</w:t>
-      </w:r>
-    </w:p>
-    <w:p>
-      <w:pPr>
-        <w:keepLines/>
-        <w:tabs>
-          <w:tab w:pos="255" w:val="left"/>
-        </w:tabs>
-        <w:spacing w:before="0" w:after="30" w:line="288" w:lineRule="auto"/>
-        <w:ind w:left="255" w:hanging="255"/>
-      </w:pPr>
-      <w:r>
-        <w:rPr>
-          <w:rFonts w:ascii="Calibri" w:hAnsi="Calibri" w:eastAsia="微软雅黑"/>
-          <w:b w:val="0"/>
-          <w:i w:val="0"/>
-          <w:color w:val="1F4E79"/>
-          <w:sz w:val="20"/>
-        </w:rPr>
-        <w:t>•</w:t>
-        <w:tab/>
-      </w:r>
-      <w:r>
-        <w:rPr>
-          <w:rFonts w:ascii="Calibri" w:hAnsi="Calibri" w:eastAsia="微软雅黑"/>
-          <w:b w:val="0"/>
-          <w:i w:val="0"/>
-          <w:sz w:val="20"/>
-        </w:rPr>
-        <w:t>方案讲解：负责会议现场产品卫星会及日常科室会宣讲，具备面向临床专家与客户的专业讲解能力。</w:t>
-      </w:r>
-    </w:p>
-    <w:p>
-      <w:pPr>
-        <w:keepNext/>
-        <w:tabs>
-          <w:tab w:pos="9978" w:val="right"/>
-        </w:tabs>
-        <w:spacing w:before="80" w:after="20" w:line="276" w:lineRule="auto"/>
-      </w:pPr>
-      <w:r>
-        <w:rPr>
-          <w:rFonts w:ascii="Calibri" w:hAnsi="Calibri" w:eastAsia="微软雅黑"/>
-          <w:b/>
-          <w:i w:val="0"/>
-          <w:sz w:val="22"/>
-        </w:rPr>
-        <w:t>广州视源电子科技股份有限公司 · 医疗显示事业部</w:t>
-      </w:r>
-      <w:r>
-        <w:rPr>
-          <w:rFonts w:ascii="Calibri" w:hAnsi="Calibri" w:eastAsia="微软雅黑"/>
-          <w:b/>
-          <w:i w:val="0"/>
-          <w:color w:val="1F4E79"/>
-          <w:sz w:val="21"/>
-        </w:rPr>
-        <w:t xml:space="preserve">  |  销售兼市场实习生</w:t>
-      </w:r>
-      <w:r>
-        <w:rPr>
-          <w:rFonts w:ascii="Calibri" w:hAnsi="Calibri" w:eastAsia="微软雅黑"/>
-          <w:b w:val="0"/>
-          <w:i w:val="0"/>
-          <w:color w:val="595959"/>
-          <w:sz w:val="19"/>
-        </w:rPr>
-        <w:tab/>
-        <w:t>2021.01 – 2021.07  |  广州</w:t>
-      </w:r>
-    </w:p>
-    <w:p>
-      <w:pPr>
-        <w:keepLines/>
-        <w:tabs>
-          <w:tab w:pos="255" w:val="left"/>
-        </w:tabs>
-        <w:spacing w:before="0" w:after="30" w:line="288" w:lineRule="auto"/>
-        <w:ind w:left="255" w:hanging="255"/>
-      </w:pPr>
-      <w:r>
-        <w:rPr>
-          <w:rFonts w:ascii="Calibri" w:hAnsi="Calibri" w:eastAsia="微软雅黑"/>
-          <w:b w:val="0"/>
-          <w:i w:val="0"/>
-          <w:color w:val="1F4E79"/>
-          <w:sz w:val="20"/>
-        </w:rPr>
-        <w:t>•</w:t>
-        <w:tab/>
-      </w:r>
-      <w:r>
-        <w:rPr>
-          <w:rFonts w:ascii="Calibri" w:hAnsi="Calibri" w:eastAsia="微软雅黑"/>
-          <w:b w:val="0"/>
-          <w:i w:val="0"/>
-          <w:sz w:val="20"/>
-        </w:rPr>
-        <w:t>医疗机构新市场开拓：陌生拜访多家医院影像科，挖掘客户需求与关注点，传递公司品牌与产品价值，发掘商机并建立客户关系。</w:t>
-      </w:r>
-    </w:p>
-    <w:p>
-      <w:pPr>
-        <w:keepLines/>
-        <w:tabs>
-          <w:tab w:pos="255" w:val="left"/>
-        </w:tabs>
-        <w:spacing w:before="0" w:after="30" w:line="288" w:lineRule="auto"/>
-        <w:ind w:left="255" w:hanging="255"/>
-      </w:pPr>
-      <w:r>
-        <w:rPr>
-          <w:rFonts w:ascii="Calibri" w:hAnsi="Calibri" w:eastAsia="微软雅黑"/>
-          <w:b w:val="0"/>
-          <w:i w:val="0"/>
-          <w:color w:val="1F4E79"/>
-          <w:sz w:val="20"/>
-        </w:rPr>
-        <w:t>•</w:t>
-        <w:tab/>
-      </w:r>
-      <w:r>
-        <w:rPr>
-          <w:rFonts w:ascii="Calibri" w:hAnsi="Calibri" w:eastAsia="微软雅黑"/>
-          <w:b w:val="0"/>
-          <w:i w:val="0"/>
-          <w:sz w:val="20"/>
-        </w:rPr>
-        <w:t>产品与方案讲解：独立接待客户及渠道商参观产业园并负责公司与产品介绍；参加学术会议负责产品讲解。</w:t>
-      </w:r>
-    </w:p>
-    <w:p>
-      <w:pPr>
-        <w:keepLines/>
-        <w:tabs>
-          <w:tab w:pos="255" w:val="left"/>
-        </w:tabs>
-        <w:spacing w:before="0" w:after="30" w:line="288" w:lineRule="auto"/>
-        <w:ind w:left="255" w:hanging="255"/>
-      </w:pPr>
-      <w:r>
-        <w:rPr>
-          <w:rFonts w:ascii="Calibri" w:hAnsi="Calibri" w:eastAsia="微软雅黑"/>
-          <w:b w:val="0"/>
-          <w:i w:val="0"/>
-          <w:color w:val="1F4E79"/>
-          <w:sz w:val="20"/>
-        </w:rPr>
-        <w:t>•</w:t>
-        <w:tab/>
-      </w:r>
-      <w:r>
-        <w:rPr>
-          <w:rFonts w:ascii="Calibri" w:hAnsi="Calibri" w:eastAsia="微软雅黑"/>
-          <w:b w:val="0"/>
-          <w:i w:val="0"/>
-          <w:sz w:val="20"/>
-        </w:rPr>
-        <w:t>市场内容产出：独立负责 4 部宣传视频拍摄与产品新闻稿撰写，围绕临床核心需求提炼产品卖点，对接媒体、设计等外部供应商。</w:t>
-      </w:r>
-    </w:p>
-    <w:p>
-      <w:pPr>
-        <w:keepNext/>
-        <w:tabs>
-          <w:tab w:pos="9978" w:val="right"/>
-        </w:tabs>
-        <w:spacing w:before="80" w:after="20" w:line="276" w:lineRule="auto"/>
-      </w:pPr>
-      <w:r>
-        <w:rPr>
-          <w:rFonts w:ascii="Calibri" w:hAnsi="Calibri" w:eastAsia="微软雅黑"/>
-          <w:b/>
-          <w:i w:val="0"/>
-          <w:sz w:val="22"/>
-        </w:rPr>
-        <w:t>上海罗氏制药有限公司 · 淋巴瘤产品组</w:t>
-      </w:r>
-      <w:r>
-        <w:rPr>
-          <w:rFonts w:ascii="Calibri" w:hAnsi="Calibri" w:eastAsia="微软雅黑"/>
-          <w:b/>
-          <w:i w:val="0"/>
-          <w:color w:val="1F4E79"/>
-          <w:sz w:val="21"/>
-        </w:rPr>
-        <w:t xml:space="preserve">  |  区域市场部实习生</w:t>
-      </w:r>
-      <w:r>
-        <w:rPr>
-          <w:rFonts w:ascii="Calibri" w:hAnsi="Calibri" w:eastAsia="微软雅黑"/>
-          <w:b w:val="0"/>
-          <w:i w:val="0"/>
-          <w:color w:val="595959"/>
-          <w:sz w:val="19"/>
-        </w:rPr>
-        <w:tab/>
-        <w:t>2019.03 – 2020.01  |  广州</w:t>
-      </w:r>
-    </w:p>
-    <w:p>
-      <w:pPr>
-        <w:keepLines/>
-        <w:tabs>
-          <w:tab w:pos="255" w:val="left"/>
-        </w:tabs>
-        <w:spacing w:before="0" w:after="30" w:line="288" w:lineRule="auto"/>
-        <w:ind w:left="255" w:hanging="255"/>
-      </w:pPr>
-      <w:r>
-        <w:rPr>
-          <w:rFonts w:ascii="Calibri" w:hAnsi="Calibri" w:eastAsia="微软雅黑"/>
-          <w:b w:val="0"/>
-          <w:i w:val="0"/>
-          <w:color w:val="1F4E79"/>
-          <w:sz w:val="20"/>
-        </w:rPr>
-        <w:t>•</w:t>
-        <w:tab/>
-      </w:r>
-      <w:r>
-        <w:rPr>
-          <w:rFonts w:ascii="Calibri" w:hAnsi="Calibri" w:eastAsia="微软雅黑"/>
-          <w:b w:val="0"/>
-          <w:i w:val="0"/>
-          <w:sz w:val="20"/>
-        </w:rPr>
-        <w:t>对接多位市场部、销售部经理，汇总区域销量、学术活动、临床专家反馈、竞品动态等数据，输出销售月报与分析 PPT，为区域市场策略制定提供支持。</w:t>
-      </w:r>
-    </w:p>
-    <w:p>
-      <w:pPr>
-        <w:keepLines/>
-        <w:tabs>
-          <w:tab w:pos="255" w:val="left"/>
-        </w:tabs>
-        <w:spacing w:before="0" w:after="30" w:line="288" w:lineRule="auto"/>
-        <w:ind w:left="255" w:hanging="255"/>
-      </w:pPr>
-      <w:r>
-        <w:rPr>
-          <w:rFonts w:ascii="Calibri" w:hAnsi="Calibri" w:eastAsia="微软雅黑"/>
-          <w:b w:val="0"/>
-          <w:i w:val="0"/>
-          <w:color w:val="1F4E79"/>
-          <w:sz w:val="20"/>
-        </w:rPr>
-        <w:t>•</w:t>
-        <w:tab/>
-      </w:r>
-      <w:r>
-        <w:rPr>
-          <w:rFonts w:ascii="Calibri" w:hAnsi="Calibri" w:eastAsia="微软雅黑"/>
-          <w:b w:val="0"/>
-          <w:i w:val="0"/>
-          <w:sz w:val="20"/>
-        </w:rPr>
-        <w:t>协助区域市场活动项目的策划、组织与落地。</w:t>
-      </w:r>
-    </w:p>
-    <w:p>
-      <w:pPr>
-        <w:spacing w:before="160" w:after="60" w:line="276" w:lineRule="auto"/>
-        <w:keepNext/>
-        <w:pBdr>
-          <w:bottom w:val="single" w:sz="8" w:space="1" w:color="1F4E79"/>
-        </w:pBdr>
-      </w:pPr>
-      <w:r>
-        <w:rPr>
-          <w:rFonts w:ascii="Calibri" w:hAnsi="Calibri" w:eastAsia="微软雅黑"/>
-          <w:b/>
-          <w:i w:val="0"/>
-          <w:color w:val="1F4E79"/>
-          <w:sz w:val="25"/>
-        </w:rPr>
-        <w:t>项目经历</w:t>
-      </w:r>
-    </w:p>
-    <w:p>
-      <w:pPr>
-        <w:keepNext/>
-        <w:tabs>
-          <w:tab w:pos="9978" w:val="right"/>
-        </w:tabs>
-        <w:spacing w:before="80" w:after="20" w:line="276" w:lineRule="auto"/>
-      </w:pPr>
-      <w:r>
-        <w:rPr>
-          <w:rFonts w:ascii="Calibri" w:hAnsi="Calibri" w:eastAsia="微软雅黑"/>
-          <w:b/>
-          <w:i w:val="0"/>
-          <w:sz w:val="22"/>
-        </w:rPr>
-        <w:t>梅州泽山口腔医院 5 年战略规划</w:t>
-      </w:r>
-      <w:r>
-        <w:rPr>
-          <w:rFonts w:ascii="Calibri" w:hAnsi="Calibri" w:eastAsia="微软雅黑"/>
-          <w:b/>
-          <w:i w:val="0"/>
-          <w:color w:val="1F4E79"/>
-          <w:sz w:val="21"/>
-        </w:rPr>
-        <w:t xml:space="preserve">  |  导师助理</w:t>
-      </w:r>
-      <w:r>
-        <w:rPr>
-          <w:rFonts w:ascii="Calibri" w:hAnsi="Calibri" w:eastAsia="微软雅黑"/>
-          <w:b w:val="0"/>
-          <w:i w:val="0"/>
-          <w:color w:val="595959"/>
-          <w:sz w:val="19"/>
-        </w:rPr>
-        <w:tab/>
-        <w:t>2018.10 – 2019.10</w:t>
-      </w:r>
-    </w:p>
-    <w:p>
-      <w:pPr>
-        <w:keepLines/>
-        <w:tabs>
-          <w:tab w:pos="255" w:val="left"/>
-        </w:tabs>
-        <w:spacing w:before="0" w:after="30" w:line="288" w:lineRule="auto"/>
-        <w:ind w:left="255" w:hanging="255"/>
-      </w:pPr>
-      <w:r>
-        <w:rPr>
-          <w:rFonts w:ascii="Calibri" w:hAnsi="Calibri" w:eastAsia="微软雅黑"/>
-          <w:b w:val="0"/>
-          <w:i w:val="0"/>
-          <w:color w:val="1F4E79"/>
-          <w:sz w:val="20"/>
-        </w:rPr>
-        <w:t>•</w:t>
-        <w:tab/>
-      </w:r>
-      <w:r>
-        <w:rPr>
-          <w:rFonts w:ascii="Calibri" w:hAnsi="Calibri" w:eastAsia="微软雅黑"/>
-          <w:b w:val="0"/>
-          <w:i w:val="0"/>
-          <w:sz w:val="20"/>
-        </w:rPr>
-        <w:t>高层对接：直接对接医院决策层，收集战略目标、市场地位、竞争格局与管理模式等信息。</w:t>
-      </w:r>
-    </w:p>
-    <w:p>
-      <w:pPr>
-        <w:keepLines/>
-        <w:tabs>
-          <w:tab w:pos="255" w:val="left"/>
-        </w:tabs>
-        <w:spacing w:before="0" w:after="30" w:line="288" w:lineRule="auto"/>
-        <w:ind w:left="255" w:hanging="255"/>
-      </w:pPr>
-      <w:r>
-        <w:rPr>
-          <w:rFonts w:ascii="Calibri" w:hAnsi="Calibri" w:eastAsia="微软雅黑"/>
-          <w:b w:val="0"/>
-          <w:i w:val="0"/>
-          <w:color w:val="1F4E79"/>
-          <w:sz w:val="20"/>
-        </w:rPr>
-        <w:t>•</w:t>
-        <w:tab/>
-      </w:r>
-      <w:r>
-        <w:rPr>
-          <w:rFonts w:ascii="Calibri" w:hAnsi="Calibri" w:eastAsia="微软雅黑"/>
-          <w:b w:val="0"/>
-          <w:i w:val="0"/>
-          <w:sz w:val="20"/>
-        </w:rPr>
-        <w:t>行业与数据分析：研究国内外口腔行业政策、技术与商业模式动态；对比竞品价目、测算人均业绩产出与人员饱和度，搭建盈亏平衡、财务绩效与客流量分析表评估新分院发展情况。</w:t>
-      </w:r>
-    </w:p>
-    <w:p>
-      <w:pPr>
-        <w:keepLines/>
-        <w:tabs>
-          <w:tab w:pos="255" w:val="left"/>
-        </w:tabs>
-        <w:spacing w:before="0" w:after="30" w:line="288" w:lineRule="auto"/>
-        <w:ind w:left="255" w:hanging="255"/>
-      </w:pPr>
-      <w:r>
-        <w:rPr>
-          <w:rFonts w:ascii="Calibri" w:hAnsi="Calibri" w:eastAsia="微软雅黑"/>
-          <w:b w:val="0"/>
-          <w:i w:val="0"/>
-          <w:color w:val="1F4E79"/>
-          <w:sz w:val="20"/>
-        </w:rPr>
-        <w:t>•</w:t>
-        <w:tab/>
-      </w:r>
-      <w:r>
-        <w:rPr>
-          <w:rFonts w:ascii="Calibri" w:hAnsi="Calibri" w:eastAsia="微软雅黑"/>
-          <w:b w:val="0"/>
-          <w:i w:val="0"/>
-          <w:sz w:val="20"/>
-        </w:rPr>
-        <w:t>策略输出：完成 SWOT 分析与基于体验触点的患者就诊流程调研（访谈 + 问卷），形成可落地的优化建议。</w:t>
-      </w:r>
-    </w:p>
-    <w:p>
-      <w:pPr>
-        <w:spacing w:before="160" w:after="60" w:line="276" w:lineRule="auto"/>
-        <w:keepNext/>
-        <w:pBdr>
-          <w:bottom w:val="single" w:sz="8" w:space="1" w:color="1F4E79"/>
-        </w:pBdr>
-      </w:pPr>
-      <w:r>
-        <w:rPr>
-          <w:rFonts w:ascii="Calibri" w:hAnsi="Calibri" w:eastAsia="微软雅黑"/>
-          <w:b/>
-          <w:i w:val="0"/>
-          <w:color w:val="1F4E79"/>
-          <w:sz w:val="25"/>
-        </w:rPr>
-        <w:t>科研课题与论文</w:t>
-      </w:r>
-    </w:p>
-    <w:p>
-      <w:pPr>
-        <w:tabs>
-          <w:tab w:pos="255" w:val="left"/>
-        </w:tabs>
-        <w:spacing w:before="0" w:after="30" w:line="288" w:lineRule="auto"/>
-        <w:ind w:left="255" w:hanging="255"/>
-      </w:pPr>
-      <w:r>
-        <w:rPr>
-          <w:rFonts w:ascii="Calibri" w:hAnsi="Calibri" w:eastAsia="微软雅黑"/>
-          <w:b w:val="0"/>
-          <w:i w:val="0"/>
-          <w:color w:val="1F4E79"/>
+          <w:color w:val="2B4A6F"/>
           <w:sz w:val="19"/>
         </w:rPr>
         <w:t>•</w:t>
@@ -1312,26 +214,63 @@
         <w:rPr>
           <w:rFonts w:ascii="Calibri" w:hAnsi="Calibri" w:eastAsia="微软雅黑"/>
           <w:b w:val="0"/>
-          <w:i w:val="0"/>
+          <w:color w:val="262626"/>
           <w:sz w:val="19"/>
         </w:rPr>
-        <w:t>主持校级课题《中医药内容营销对消费意愿的影响机制研究》。</w:t>
+        <w:t>研究方向：市场营销（品牌营销、医药营销）；连续三年获校级奖学金（一等 2 次、二等 1 次）。</w:t>
       </w:r>
     </w:p>
     <w:p>
       <w:pPr>
+        <w:keepNext/>
         <w:tabs>
-          <w:tab w:pos="255" w:val="left"/>
+          <w:tab w:pos="9752" w:val="right"/>
         </w:tabs>
-        <w:spacing w:before="0" w:after="30" w:line="288" w:lineRule="auto"/>
-        <w:ind w:left="255" w:hanging="255"/>
+        <w:spacing w:before="140" w:after="40" w:line="264" w:lineRule="auto"/>
+      </w:pPr>
+      <w:r>
+        <w:rPr>
+          <w:rFonts w:ascii="Calibri" w:hAnsi="Calibri" w:eastAsia="微软雅黑"/>
+          <w:b/>
+          <w:color w:val="262626"/>
+          <w:sz w:val="21"/>
+        </w:rPr>
+        <w:t>广州中医药大学</w:t>
+      </w:r>
+      <w:r>
+        <w:rPr>
+          <w:rFonts w:ascii="Calibri" w:hAnsi="Calibri" w:eastAsia="微软雅黑"/>
+          <w:b w:val="0"/>
+          <w:color w:val="6B6B6B"/>
+          <w:sz w:val="19"/>
+        </w:rPr>
+        <w:t xml:space="preserve">　国际经济与贸易（医药方向） · 本科</w:t>
+      </w:r>
+      <w:r>
+        <w:rPr>
+          <w:rFonts w:ascii="Calibri" w:hAnsi="Calibri" w:eastAsia="微软雅黑"/>
+          <w:b w:val="0"/>
+          <w:color w:val="6B6B6B"/>
+          <w:sz w:val="18"/>
+        </w:rPr>
+        <w:tab/>
+        <w:t>2015.09 – 2019.06　广州</w:t>
+      </w:r>
+    </w:p>
+    <w:p>
+      <w:pPr>
+        <w:keepLines/>
+        <w:tabs>
+          <w:tab w:pos="227" w:val="left"/>
+        </w:tabs>
+        <w:spacing w:before="0" w:after="60" w:line="312" w:lineRule="auto"/>
+        <w:ind w:left="227" w:hanging="227"/>
       </w:pPr>
       <w:r>
         <w:rPr>
           <w:rFonts w:ascii="Calibri" w:hAnsi="Calibri" w:eastAsia="微软雅黑"/>
           <w:b w:val="0"/>
-          <w:i w:val="0"/>
-          <w:color w:val="1F4E79"/>
+          <w:color w:val="2B4A6F"/>
           <w:sz w:val="19"/>
         </w:rPr>
         <w:t>•</w:t>
@@ -1341,26 +280,252 @@
         <w:rPr>
           <w:rFonts w:ascii="Calibri" w:hAnsi="Calibri" w:eastAsia="微软雅黑"/>
           <w:b w:val="0"/>
-          <w:i w:val="0"/>
+          <w:color w:val="262626"/>
           <w:sz w:val="19"/>
         </w:rPr>
-        <w:t>《中医药内容营销对消费意愿的影响机制：形而上与形而下内容的双路径作用》，《商场现代化》，2026。</w:t>
+        <w:t>GPA 3.8，专业排名第 2；修读药理学、西医学概论等医药课程；连续四年获校级奖学金。</w:t>
       </w:r>
     </w:p>
     <w:p>
       <w:pPr>
+        <w:spacing w:before="240" w:after="100" w:line="240" w:lineRule="auto"/>
+        <w:keepNext/>
+        <w:pBdr>
+          <w:bottom w:val="single" w:sz="6" w:space="3" w:color="C9D3DE"/>
+        </w:pBdr>
+      </w:pPr>
+      <w:r>
+        <w:rPr>
+          <w:rFonts w:ascii="Calibri" w:hAnsi="Calibri" w:eastAsia="微软雅黑"/>
+          <w:b/>
+          <w:color w:val="2B4A6F"/>
+          <w:sz w:val="23"/>
+        </w:rPr>
+        <w:t>核心优势</w:t>
+      </w:r>
+    </w:p>
+    <w:p>
+      <w:pPr>
+        <w:keepLines/>
         <w:tabs>
-          <w:tab w:pos="255" w:val="left"/>
+          <w:tab w:pos="227" w:val="left"/>
         </w:tabs>
-        <w:spacing w:before="0" w:after="30" w:line="288" w:lineRule="auto"/>
-        <w:ind w:left="255" w:hanging="255"/>
+        <w:spacing w:before="0" w:after="60" w:line="312" w:lineRule="auto"/>
+        <w:ind w:left="227" w:hanging="227"/>
       </w:pPr>
       <w:r>
         <w:rPr>
           <w:rFonts w:ascii="Calibri" w:hAnsi="Calibri" w:eastAsia="微软雅黑"/>
           <w:b w:val="0"/>
-          <w:i w:val="0"/>
-          <w:color w:val="1F4E79"/>
+          <w:color w:val="2B4A6F"/>
+          <w:sz w:val="19"/>
+        </w:rPr>
+        <w:t>•</w:t>
+        <w:tab/>
+      </w:r>
+      <w:r>
+        <w:rPr>
+          <w:rFonts w:ascii="Calibri" w:hAnsi="Calibri" w:eastAsia="微软雅黑"/>
+          <w:b/>
+          <w:color w:val="262626"/>
+          <w:sz w:val="19"/>
+        </w:rPr>
+        <w:t xml:space="preserve">医疗健康行业背景　</w:t>
+      </w:r>
+      <w:r>
+        <w:rPr>
+          <w:rFonts w:ascii="Calibri" w:hAnsi="Calibri" w:eastAsia="微软雅黑"/>
+          <w:b w:val="0"/>
+          <w:color w:val="262626"/>
+          <w:sz w:val="19"/>
+        </w:rPr>
+        <w:t>医药方向本科、医药营销方向硕士；强生医疗 1.5 年一线销售，罗氏制药、视源医疗显示实习；2024 年起以合伙人身份参与医疗器械渠道业务，开发 4 家医院、8 个产品入院。</w:t>
+      </w:r>
+    </w:p>
+    <w:p>
+      <w:pPr>
+        <w:keepLines/>
+        <w:tabs>
+          <w:tab w:pos="227" w:val="left"/>
+        </w:tabs>
+        <w:spacing w:before="0" w:after="60" w:line="312" w:lineRule="auto"/>
+        <w:ind w:left="227" w:hanging="227"/>
+      </w:pPr>
+      <w:r>
+        <w:rPr>
+          <w:rFonts w:ascii="Calibri" w:hAnsi="Calibri" w:eastAsia="微软雅黑"/>
+          <w:b w:val="0"/>
+          <w:color w:val="2B4A6F"/>
+          <w:sz w:val="19"/>
+        </w:rPr>
+        <w:t>•</w:t>
+        <w:tab/>
+      </w:r>
+      <w:r>
+        <w:rPr>
+          <w:rFonts w:ascii="Calibri" w:hAnsi="Calibri" w:eastAsia="微软雅黑"/>
+          <w:b/>
+          <w:color w:val="262626"/>
+          <w:sz w:val="19"/>
+        </w:rPr>
+        <w:t xml:space="preserve">医院与渠道客户开拓　</w:t>
+      </w:r>
+      <w:r>
+        <w:rPr>
+          <w:rFonts w:ascii="Calibri" w:hAnsi="Calibri" w:eastAsia="微软雅黑"/>
+          <w:b w:val="0"/>
+          <w:color w:val="262626"/>
+          <w:sz w:val="19"/>
+        </w:rPr>
+        <w:t>有从陌拜到准入、从科主任到副院长的医院客户开发经验，也有与渠道商合作谈判的经历，理解医院、厂家、渠道三方的诉求。</w:t>
+      </w:r>
+    </w:p>
+    <w:p>
+      <w:pPr>
+        <w:keepLines/>
+        <w:tabs>
+          <w:tab w:pos="227" w:val="left"/>
+        </w:tabs>
+        <w:spacing w:before="0" w:after="60" w:line="312" w:lineRule="auto"/>
+        <w:ind w:left="227" w:hanging="227"/>
+      </w:pPr>
+      <w:r>
+        <w:rPr>
+          <w:rFonts w:ascii="Calibri" w:hAnsi="Calibri" w:eastAsia="微软雅黑"/>
+          <w:b w:val="0"/>
+          <w:color w:val="2B4A6F"/>
+          <w:sz w:val="19"/>
+        </w:rPr>
+        <w:t>•</w:t>
+        <w:tab/>
+      </w:r>
+      <w:r>
+        <w:rPr>
+          <w:rFonts w:ascii="Calibri" w:hAnsi="Calibri" w:eastAsia="微软雅黑"/>
+          <w:b/>
+          <w:color w:val="262626"/>
+          <w:sz w:val="19"/>
+        </w:rPr>
+        <w:t xml:space="preserve">行业研究与表达　</w:t>
+      </w:r>
+      <w:r>
+        <w:rPr>
+          <w:rFonts w:ascii="Calibri" w:hAnsi="Calibri" w:eastAsia="微软雅黑"/>
+          <w:b w:val="0"/>
+          <w:color w:val="262626"/>
+          <w:sz w:val="19"/>
+        </w:rPr>
+        <w:t>主讲数字营销、营销渠道管理课程，主持医药内容营销课题并发表论文；曾负责卫星会与科室会宣讲，能独立完成行业分析并清晰讲解。</w:t>
+      </w:r>
+    </w:p>
+    <w:p>
+      <w:pPr>
+        <w:keepLines/>
+        <w:tabs>
+          <w:tab w:pos="227" w:val="left"/>
+        </w:tabs>
+        <w:spacing w:before="0" w:after="60" w:line="312" w:lineRule="auto"/>
+        <w:ind w:left="227" w:hanging="227"/>
+      </w:pPr>
+      <w:r>
+        <w:rPr>
+          <w:rFonts w:ascii="Calibri" w:hAnsi="Calibri" w:eastAsia="微软雅黑"/>
+          <w:b w:val="0"/>
+          <w:color w:val="2B4A6F"/>
+          <w:sz w:val="19"/>
+        </w:rPr>
+        <w:t>•</w:t>
+        <w:tab/>
+      </w:r>
+      <w:r>
+        <w:rPr>
+          <w:rFonts w:ascii="Calibri" w:hAnsi="Calibri" w:eastAsia="微软雅黑"/>
+          <w:b/>
+          <w:color w:val="262626"/>
+          <w:sz w:val="19"/>
+        </w:rPr>
+        <w:t xml:space="preserve">数字化与 AI 应用　</w:t>
+      </w:r>
+      <w:r>
+        <w:rPr>
+          <w:rFonts w:ascii="Calibri" w:hAnsi="Calibri" w:eastAsia="微软雅黑"/>
+          <w:b w:val="0"/>
+          <w:color w:val="262626"/>
+          <w:sz w:val="19"/>
+        </w:rPr>
+        <w:t>研究方向含数字营销与 AI 营销；日常使用 Claude、Cursor、Codex、WorkBuddy 等工具辅助研究与方案撰写，关注 AI 在企业服务中的落地。</w:t>
+      </w:r>
+    </w:p>
+    <w:p>
+      <w:pPr>
+        <w:spacing w:before="240" w:after="100" w:line="240" w:lineRule="auto"/>
+        <w:keepNext/>
+        <w:pBdr>
+          <w:bottom w:val="single" w:sz="6" w:space="3" w:color="C9D3DE"/>
+        </w:pBdr>
+      </w:pPr>
+      <w:r>
+        <w:rPr>
+          <w:rFonts w:ascii="Calibri" w:hAnsi="Calibri" w:eastAsia="微软雅黑"/>
+          <w:b/>
+          <w:color w:val="2B4A6F"/>
+          <w:sz w:val="23"/>
+        </w:rPr>
+        <w:t>工作经历</w:t>
+      </w:r>
+    </w:p>
+    <w:p>
+      <w:pPr>
+        <w:keepNext/>
+        <w:tabs>
+          <w:tab w:pos="9752" w:val="right"/>
+        </w:tabs>
+        <w:spacing w:before="140" w:after="40" w:line="264" w:lineRule="auto"/>
+      </w:pPr>
+      <w:r>
+        <w:rPr>
+          <w:rFonts w:ascii="Calibri" w:hAnsi="Calibri" w:eastAsia="微软雅黑"/>
+          <w:b/>
+          <w:color w:val="262626"/>
+          <w:sz w:val="21"/>
+        </w:rPr>
+        <w:t>广州南方学院 · 商学院</w:t>
+      </w:r>
+      <w:r>
+        <w:rPr>
+          <w:rFonts w:ascii="Calibri" w:hAnsi="Calibri" w:eastAsia="微软雅黑"/>
+          <w:b w:val="0"/>
+          <w:color w:val="6B6B6B"/>
+          <w:sz w:val="19"/>
+        </w:rPr>
+        <w:t xml:space="preserve">　市场营销专任教师</w:t>
+      </w:r>
+      <w:r>
+        <w:rPr>
+          <w:rFonts w:ascii="Calibri" w:hAnsi="Calibri" w:eastAsia="微软雅黑"/>
+          <w:b w:val="0"/>
+          <w:color w:val="6B6B6B"/>
+          <w:sz w:val="18"/>
+        </w:rPr>
+        <w:tab/>
+        <w:t>2024.02 – 至今　广州</w:t>
+      </w:r>
+    </w:p>
+    <w:p>
+      <w:pPr>
+        <w:keepNext/>
+        <w:keepLines/>
+        <w:tabs>
+          <w:tab w:pos="227" w:val="left"/>
+        </w:tabs>
+        <w:spacing w:before="0" w:after="60" w:line="312" w:lineRule="auto"/>
+        <w:ind w:left="227" w:hanging="227"/>
+      </w:pPr>
+      <w:r>
+        <w:rPr>
+          <w:rFonts w:ascii="Calibri" w:hAnsi="Calibri" w:eastAsia="微软雅黑"/>
+          <w:b w:val="0"/>
+          <w:color w:val="2B4A6F"/>
           <w:sz w:val="19"/>
         </w:rPr>
         <w:t>•</w:t>
@@ -1370,26 +535,26 @@
         <w:rPr>
           <w:rFonts w:ascii="Calibri" w:hAnsi="Calibri" w:eastAsia="微软雅黑"/>
           <w:b w:val="0"/>
-          <w:i w:val="0"/>
+          <w:color w:val="262626"/>
           <w:sz w:val="19"/>
         </w:rPr>
-        <w:t>《透视直播电商解读营销的流变与永恒》，广东省社科联 2020 年岭南学术论坛（新营销·新经济）会议论文，获评优秀论文。</w:t>
+        <w:t>主讲《数字营销》《营销渠道管理》《电子商务原理》课程，负责课程设计与学生指导。</w:t>
       </w:r>
     </w:p>
     <w:p>
       <w:pPr>
+        <w:keepLines/>
         <w:tabs>
-          <w:tab w:pos="255" w:val="left"/>
+          <w:tab w:pos="227" w:val="left"/>
         </w:tabs>
-        <w:spacing w:before="0" w:after="30" w:line="288" w:lineRule="auto"/>
-        <w:ind w:left="255" w:hanging="255"/>
+        <w:spacing w:before="0" w:after="60" w:line="312" w:lineRule="auto"/>
+        <w:ind w:left="227" w:hanging="227"/>
       </w:pPr>
       <w:r>
         <w:rPr>
           <w:rFonts w:ascii="Calibri" w:hAnsi="Calibri" w:eastAsia="微软雅黑"/>
           <w:b w:val="0"/>
-          <w:i w:val="0"/>
-          <w:color w:val="1F4E79"/>
+          <w:color w:val="2B4A6F"/>
           <w:sz w:val="19"/>
         </w:rPr>
         <w:t>•</w:t>
@@ -1399,46 +564,705 @@
         <w:rPr>
           <w:rFonts w:ascii="Calibri" w:hAnsi="Calibri" w:eastAsia="微软雅黑"/>
           <w:b w:val="0"/>
-          <w:i w:val="0"/>
+          <w:color w:val="262626"/>
           <w:sz w:val="19"/>
         </w:rPr>
-        <w:t>《国产动漫火爆，动漫 IP 如何打动消费者》，《国际品牌观察》，2020（知网收录）。</w:t>
+        <w:t>主持校级课题《中医药内容营销对消费意愿的影响机制研究》，成果发表于《商场现代化》（2026）。</w:t>
       </w:r>
     </w:p>
     <w:p>
       <w:pPr>
-        <w:spacing w:before="160" w:after="60" w:line="276" w:lineRule="auto"/>
+        <w:keepNext/>
+        <w:tabs>
+          <w:tab w:pos="9752" w:val="right"/>
+        </w:tabs>
+        <w:spacing w:before="140" w:after="40" w:line="264" w:lineRule="auto"/>
+      </w:pPr>
+      <w:r>
+        <w:rPr>
+          <w:rFonts w:ascii="Calibri" w:hAnsi="Calibri" w:eastAsia="微软雅黑"/>
+          <w:b/>
+          <w:color w:val="262626"/>
+          <w:sz w:val="21"/>
+        </w:rPr>
+        <w:t>医疗器械渠道业务（与前强生销售经理合伙）</w:t>
+      </w:r>
+      <w:r>
+        <w:rPr>
+          <w:rFonts w:ascii="Calibri" w:hAnsi="Calibri" w:eastAsia="微软雅黑"/>
+          <w:b w:val="0"/>
+          <w:color w:val="6B6B6B"/>
+          <w:sz w:val="19"/>
+        </w:rPr>
+        <w:t xml:space="preserve">　合伙人（兼职）</w:t>
+      </w:r>
+      <w:r>
+        <w:rPr>
+          <w:rFonts w:ascii="Calibri" w:hAnsi="Calibri" w:eastAsia="微软雅黑"/>
+          <w:b w:val="0"/>
+          <w:color w:val="6B6B6B"/>
+          <w:sz w:val="18"/>
+        </w:rPr>
+        <w:tab/>
+        <w:t>2024 – 至今　广州</w:t>
+      </w:r>
+    </w:p>
+    <w:p>
+      <w:pPr>
+        <w:keepNext/>
+        <w:keepLines/>
+        <w:tabs>
+          <w:tab w:pos="227" w:val="left"/>
+        </w:tabs>
+        <w:spacing w:before="0" w:after="60" w:line="312" w:lineRule="auto"/>
+        <w:ind w:left="227" w:hanging="227"/>
+      </w:pPr>
+      <w:r>
+        <w:rPr>
+          <w:rFonts w:ascii="Calibri" w:hAnsi="Calibri" w:eastAsia="微软雅黑"/>
+          <w:b w:val="0"/>
+          <w:color w:val="2B4A6F"/>
+          <w:sz w:val="19"/>
+        </w:rPr>
+        <w:t>•</w:t>
+        <w:tab/>
+      </w:r>
+      <w:r>
+        <w:rPr>
+          <w:rFonts w:ascii="Calibri" w:hAnsi="Calibri" w:eastAsia="微软雅黑"/>
+          <w:b w:val="0"/>
+          <w:color w:val="262626"/>
+          <w:sz w:val="19"/>
+        </w:rPr>
+        <w:t>负责新医院开发：对接副院长、科主任等决策人，完成 4 家医院准入、8 个产品入院。</w:t>
+      </w:r>
+    </w:p>
+    <w:p>
+      <w:pPr>
+        <w:keepNext/>
+        <w:keepLines/>
+        <w:tabs>
+          <w:tab w:pos="227" w:val="left"/>
+        </w:tabs>
+        <w:spacing w:before="0" w:after="60" w:line="312" w:lineRule="auto"/>
+        <w:ind w:left="227" w:hanging="227"/>
+      </w:pPr>
+      <w:r>
+        <w:rPr>
+          <w:rFonts w:ascii="Calibri" w:hAnsi="Calibri" w:eastAsia="微软雅黑"/>
+          <w:b w:val="0"/>
+          <w:color w:val="2B4A6F"/>
+          <w:sz w:val="19"/>
+        </w:rPr>
+        <w:t>•</w:t>
+        <w:tab/>
+      </w:r>
+      <w:r>
+        <w:rPr>
+          <w:rFonts w:ascii="Calibri" w:hAnsi="Calibri" w:eastAsia="微软雅黑"/>
+          <w:b w:val="0"/>
+          <w:color w:val="262626"/>
+          <w:sz w:val="19"/>
+        </w:rPr>
+        <w:t>跨境医疗项目：带领团队与 4 家私立医院洽谈合作，建立 5 家合作渠道商。</w:t>
+      </w:r>
+    </w:p>
+    <w:p>
+      <w:pPr>
+        <w:keepLines/>
+        <w:tabs>
+          <w:tab w:pos="227" w:val="left"/>
+        </w:tabs>
+        <w:spacing w:before="0" w:after="60" w:line="312" w:lineRule="auto"/>
+        <w:ind w:left="227" w:hanging="227"/>
+      </w:pPr>
+      <w:r>
+        <w:rPr>
+          <w:rFonts w:ascii="Calibri" w:hAnsi="Calibri" w:eastAsia="微软雅黑"/>
+          <w:b w:val="0"/>
+          <w:color w:val="2B4A6F"/>
+          <w:sz w:val="19"/>
+        </w:rPr>
+        <w:t>•</w:t>
+        <w:tab/>
+      </w:r>
+      <w:r>
+        <w:rPr>
+          <w:rFonts w:ascii="Calibri" w:hAnsi="Calibri" w:eastAsia="微软雅黑"/>
+          <w:b w:val="0"/>
+          <w:color w:val="262626"/>
+          <w:sz w:val="19"/>
+        </w:rPr>
+        <w:t>以渠道商身份参与经营，理解渠道商的经营逻辑与合作诉求。</w:t>
+      </w:r>
+    </w:p>
+    <w:p>
+      <w:pPr>
+        <w:keepNext/>
+        <w:tabs>
+          <w:tab w:pos="9752" w:val="right"/>
+        </w:tabs>
+        <w:spacing w:before="140" w:after="40" w:line="264" w:lineRule="auto"/>
+      </w:pPr>
+      <w:r>
+        <w:rPr>
+          <w:rFonts w:ascii="Calibri" w:hAnsi="Calibri" w:eastAsia="微软雅黑"/>
+          <w:b/>
+          <w:color w:val="262626"/>
+          <w:sz w:val="21"/>
+        </w:rPr>
+        <w:t>强生（上海）医疗器材有限公司 · 能量外科与微创外科</w:t>
+      </w:r>
+      <w:r>
+        <w:rPr>
+          <w:rFonts w:ascii="Calibri" w:hAnsi="Calibri" w:eastAsia="微软雅黑"/>
+          <w:b w:val="0"/>
+          <w:color w:val="6B6B6B"/>
+          <w:sz w:val="19"/>
+        </w:rPr>
+        <w:t xml:space="preserve">　销售培训生</w:t>
+      </w:r>
+      <w:r>
+        <w:rPr>
+          <w:rFonts w:ascii="Calibri" w:hAnsi="Calibri" w:eastAsia="微软雅黑"/>
+          <w:b w:val="0"/>
+          <w:color w:val="6B6B6B"/>
+          <w:sz w:val="18"/>
+        </w:rPr>
+        <w:tab/>
+        <w:t>2022.07 – 2024.01　广州</w:t>
+      </w:r>
+    </w:p>
+    <w:p>
+      <w:pPr>
+        <w:keepLines/>
+        <w:tabs>
+          <w:tab w:pos="227" w:val="left"/>
+        </w:tabs>
+        <w:spacing w:before="0" w:after="60" w:line="312" w:lineRule="auto"/>
+        <w:ind w:left="227" w:hanging="227"/>
+      </w:pPr>
+      <w:r>
+        <w:rPr>
+          <w:rFonts w:ascii="Calibri" w:hAnsi="Calibri" w:eastAsia="微软雅黑"/>
+          <w:b w:val="0"/>
+          <w:color w:val="2B4A6F"/>
+          <w:sz w:val="19"/>
+        </w:rPr>
+        <w:t>•</w:t>
+        <w:tab/>
+      </w:r>
+      <w:r>
+        <w:rPr>
+          <w:rFonts w:ascii="Calibri" w:hAnsi="Calibri" w:eastAsia="微软雅黑"/>
+          <w:b w:val="0"/>
+          <w:color w:val="262626"/>
+          <w:sz w:val="19"/>
+        </w:rPr>
+        <w:t>区域生意规划：收集市场与竞品信息，制定区域销售策略并落地，超额完成业绩指标。</w:t>
+      </w:r>
+    </w:p>
+    <w:p>
+      <w:pPr>
+        <w:keepLines/>
+        <w:tabs>
+          <w:tab w:pos="227" w:val="left"/>
+        </w:tabs>
+        <w:spacing w:before="0" w:after="60" w:line="312" w:lineRule="auto"/>
+        <w:ind w:left="227" w:hanging="227"/>
+      </w:pPr>
+      <w:r>
+        <w:rPr>
+          <w:rFonts w:ascii="Calibri" w:hAnsi="Calibri" w:eastAsia="微软雅黑"/>
+          <w:b w:val="0"/>
+          <w:color w:val="2B4A6F"/>
+          <w:sz w:val="19"/>
+        </w:rPr>
+        <w:t>•</w:t>
+        <w:tab/>
+      </w:r>
+      <w:r>
+        <w:rPr>
+          <w:rFonts w:ascii="Calibri" w:hAnsi="Calibri" w:eastAsia="微软雅黑"/>
+          <w:b w:val="0"/>
+          <w:color w:val="262626"/>
+          <w:sz w:val="19"/>
+        </w:rPr>
+        <w:t>重点客户开拓与维护：拜访核心客户，了解需求并提供针对性方案，建立长期客户关系。</w:t>
+      </w:r>
+    </w:p>
+    <w:p>
+      <w:pPr>
+        <w:keepLines/>
+        <w:tabs>
+          <w:tab w:pos="227" w:val="left"/>
+        </w:tabs>
+        <w:spacing w:before="0" w:after="60" w:line="312" w:lineRule="auto"/>
+        <w:ind w:left="227" w:hanging="227"/>
+      </w:pPr>
+      <w:r>
+        <w:rPr>
+          <w:rFonts w:ascii="Calibri" w:hAnsi="Calibri" w:eastAsia="微软雅黑"/>
+          <w:b w:val="0"/>
+          <w:color w:val="2B4A6F"/>
+          <w:sz w:val="19"/>
+        </w:rPr>
+        <w:t>•</w:t>
+        <w:tab/>
+      </w:r>
+      <w:r>
+        <w:rPr>
+          <w:rFonts w:ascii="Calibri" w:hAnsi="Calibri" w:eastAsia="微软雅黑"/>
+          <w:b w:val="0"/>
+          <w:color w:val="262626"/>
+          <w:sz w:val="19"/>
+        </w:rPr>
+        <w:t>渠道管理：协助经销商制定行动计划，负责渠道人员产品培训，协同拜访重点客户，定期盘点渠道业绩。</w:t>
+      </w:r>
+    </w:p>
+    <w:p>
+      <w:pPr>
+        <w:keepLines/>
+        <w:tabs>
+          <w:tab w:pos="227" w:val="left"/>
+        </w:tabs>
+        <w:spacing w:before="0" w:after="60" w:line="312" w:lineRule="auto"/>
+        <w:ind w:left="227" w:hanging="227"/>
+      </w:pPr>
+      <w:r>
+        <w:rPr>
+          <w:rFonts w:ascii="Calibri" w:hAnsi="Calibri" w:eastAsia="微软雅黑"/>
+          <w:b w:val="0"/>
+          <w:color w:val="2B4A6F"/>
+          <w:sz w:val="19"/>
+        </w:rPr>
+        <w:t>•</w:t>
+        <w:tab/>
+      </w:r>
+      <w:r>
+        <w:rPr>
+          <w:rFonts w:ascii="Calibri" w:hAnsi="Calibri" w:eastAsia="微软雅黑"/>
+          <w:b w:val="0"/>
+          <w:color w:val="262626"/>
+          <w:sz w:val="19"/>
+        </w:rPr>
+        <w:t>学术活动与跨部门协作：策划并落地 10+ 场学术活动（单场最高 40 万元）；配合市场部推进白皮书、手术指南编写；负责卫星会及科室会宣讲。</w:t>
+      </w:r>
+    </w:p>
+    <w:p>
+      <w:pPr>
+        <w:keepNext/>
+        <w:tabs>
+          <w:tab w:pos="9752" w:val="right"/>
+        </w:tabs>
+        <w:spacing w:before="140" w:after="40" w:line="264" w:lineRule="auto"/>
+      </w:pPr>
+      <w:r>
+        <w:rPr>
+          <w:rFonts w:ascii="Calibri" w:hAnsi="Calibri" w:eastAsia="微软雅黑"/>
+          <w:b/>
+          <w:color w:val="262626"/>
+          <w:sz w:val="21"/>
+        </w:rPr>
+        <w:t>广州视源电子科技股份有限公司 · 医疗显示事业部</w:t>
+      </w:r>
+      <w:r>
+        <w:rPr>
+          <w:rFonts w:ascii="Calibri" w:hAnsi="Calibri" w:eastAsia="微软雅黑"/>
+          <w:b w:val="0"/>
+          <w:color w:val="6B6B6B"/>
+          <w:sz w:val="19"/>
+        </w:rPr>
+        <w:t xml:space="preserve">　销售兼市场实习生</w:t>
+      </w:r>
+      <w:r>
+        <w:rPr>
+          <w:rFonts w:ascii="Calibri" w:hAnsi="Calibri" w:eastAsia="微软雅黑"/>
+          <w:b w:val="0"/>
+          <w:color w:val="6B6B6B"/>
+          <w:sz w:val="18"/>
+        </w:rPr>
+        <w:tab/>
+        <w:t>2021.01 – 2021.07　广州</w:t>
+      </w:r>
+    </w:p>
+    <w:p>
+      <w:pPr>
+        <w:keepNext/>
+        <w:keepLines/>
+        <w:tabs>
+          <w:tab w:pos="227" w:val="left"/>
+        </w:tabs>
+        <w:spacing w:before="0" w:after="60" w:line="312" w:lineRule="auto"/>
+        <w:ind w:left="227" w:hanging="227"/>
+      </w:pPr>
+      <w:r>
+        <w:rPr>
+          <w:rFonts w:ascii="Calibri" w:hAnsi="Calibri" w:eastAsia="微软雅黑"/>
+          <w:b w:val="0"/>
+          <w:color w:val="2B4A6F"/>
+          <w:sz w:val="19"/>
+        </w:rPr>
+        <w:t>•</w:t>
+        <w:tab/>
+      </w:r>
+      <w:r>
+        <w:rPr>
+          <w:rFonts w:ascii="Calibri" w:hAnsi="Calibri" w:eastAsia="微软雅黑"/>
+          <w:b w:val="0"/>
+          <w:color w:val="262626"/>
+          <w:sz w:val="19"/>
+        </w:rPr>
+        <w:t>陌拜多家医院影像科开拓新市场，了解客户需求并传递产品价值；接待客户与渠道商参观并负责产品介绍。</w:t>
+      </w:r>
+    </w:p>
+    <w:p>
+      <w:pPr>
+        <w:keepLines/>
+        <w:tabs>
+          <w:tab w:pos="227" w:val="left"/>
+        </w:tabs>
+        <w:spacing w:before="0" w:after="60" w:line="312" w:lineRule="auto"/>
+        <w:ind w:left="227" w:hanging="227"/>
+      </w:pPr>
+      <w:r>
+        <w:rPr>
+          <w:rFonts w:ascii="Calibri" w:hAnsi="Calibri" w:eastAsia="微软雅黑"/>
+          <w:b w:val="0"/>
+          <w:color w:val="2B4A6F"/>
+          <w:sz w:val="19"/>
+        </w:rPr>
+        <w:t>•</w:t>
+        <w:tab/>
+      </w:r>
+      <w:r>
+        <w:rPr>
+          <w:rFonts w:ascii="Calibri" w:hAnsi="Calibri" w:eastAsia="微软雅黑"/>
+          <w:b w:val="0"/>
+          <w:color w:val="262626"/>
+          <w:sz w:val="19"/>
+        </w:rPr>
+        <w:t>独立负责 4 部产品宣传视频与新闻稿的策划制作，对接媒体、设计等外部供应商。</w:t>
+      </w:r>
+    </w:p>
+    <w:p>
+      <w:pPr>
+        <w:keepNext/>
+        <w:tabs>
+          <w:tab w:pos="9752" w:val="right"/>
+        </w:tabs>
+        <w:spacing w:before="140" w:after="40" w:line="264" w:lineRule="auto"/>
+      </w:pPr>
+      <w:r>
+        <w:rPr>
+          <w:rFonts w:ascii="Calibri" w:hAnsi="Calibri" w:eastAsia="微软雅黑"/>
+          <w:b/>
+          <w:color w:val="262626"/>
+          <w:sz w:val="21"/>
+        </w:rPr>
+        <w:t>上海罗氏制药有限公司 · 淋巴瘤产品组</w:t>
+      </w:r>
+      <w:r>
+        <w:rPr>
+          <w:rFonts w:ascii="Calibri" w:hAnsi="Calibri" w:eastAsia="微软雅黑"/>
+          <w:b w:val="0"/>
+          <w:color w:val="6B6B6B"/>
+          <w:sz w:val="19"/>
+        </w:rPr>
+        <w:t xml:space="preserve">　区域市场部实习生</w:t>
+      </w:r>
+      <w:r>
+        <w:rPr>
+          <w:rFonts w:ascii="Calibri" w:hAnsi="Calibri" w:eastAsia="微软雅黑"/>
+          <w:b w:val="0"/>
+          <w:color w:val="6B6B6B"/>
+          <w:sz w:val="18"/>
+        </w:rPr>
+        <w:tab/>
+        <w:t>2019.03 – 2020.01　广州</w:t>
+      </w:r>
+    </w:p>
+    <w:p>
+      <w:pPr>
+        <w:keepLines/>
+        <w:tabs>
+          <w:tab w:pos="227" w:val="left"/>
+        </w:tabs>
+        <w:spacing w:before="0" w:after="60" w:line="312" w:lineRule="auto"/>
+        <w:ind w:left="227" w:hanging="227"/>
+      </w:pPr>
+      <w:r>
+        <w:rPr>
+          <w:rFonts w:ascii="Calibri" w:hAnsi="Calibri" w:eastAsia="微软雅黑"/>
+          <w:b w:val="0"/>
+          <w:color w:val="2B4A6F"/>
+          <w:sz w:val="19"/>
+        </w:rPr>
+        <w:t>•</w:t>
+        <w:tab/>
+      </w:r>
+      <w:r>
+        <w:rPr>
+          <w:rFonts w:ascii="Calibri" w:hAnsi="Calibri" w:eastAsia="微软雅黑"/>
+          <w:b w:val="0"/>
+          <w:color w:val="262626"/>
+          <w:sz w:val="19"/>
+        </w:rPr>
+        <w:t>汇总区域销量、学术活动、专家反馈与竞品动态，输出销售月报与分析 PPT；协助区域市场活动的策划与执行。</w:t>
+      </w:r>
+    </w:p>
+    <w:p>
+      <w:pPr>
+        <w:spacing w:before="240" w:after="100" w:line="240" w:lineRule="auto"/>
         <w:keepNext/>
         <w:pBdr>
-          <w:bottom w:val="single" w:sz="8" w:space="1" w:color="1F4E79"/>
+          <w:bottom w:val="single" w:sz="6" w:space="3" w:color="C9D3DE"/>
         </w:pBdr>
       </w:pPr>
       <w:r>
         <w:rPr>
           <w:rFonts w:ascii="Calibri" w:hAnsi="Calibri" w:eastAsia="微软雅黑"/>
           <w:b/>
-          <w:i w:val="0"/>
-          <w:color w:val="1F4E79"/>
-          <w:sz w:val="25"/>
+          <w:color w:val="2B4A6F"/>
+          <w:sz w:val="23"/>
         </w:rPr>
-        <w:t>技能与语言</w:t>
+        <w:t>项目经历</w:t>
       </w:r>
     </w:p>
     <w:p>
       <w:pPr>
+        <w:keepNext/>
         <w:tabs>
-          <w:tab w:pos="255" w:val="left"/>
+          <w:tab w:pos="9752" w:val="right"/>
         </w:tabs>
-        <w:spacing w:before="0" w:after="30" w:line="288" w:lineRule="auto"/>
-        <w:ind w:left="255" w:hanging="255"/>
+        <w:spacing w:before="140" w:after="40" w:line="264" w:lineRule="auto"/>
+      </w:pPr>
+      <w:r>
+        <w:rPr>
+          <w:rFonts w:ascii="Calibri" w:hAnsi="Calibri" w:eastAsia="微软雅黑"/>
+          <w:b/>
+          <w:color w:val="262626"/>
+          <w:sz w:val="21"/>
+        </w:rPr>
+        <w:t>梅州泽山口腔医院 5 年战略规划</w:t>
+      </w:r>
+      <w:r>
+        <w:rPr>
+          <w:rFonts w:ascii="Calibri" w:hAnsi="Calibri" w:eastAsia="微软雅黑"/>
+          <w:b w:val="0"/>
+          <w:color w:val="6B6B6B"/>
+          <w:sz w:val="19"/>
+        </w:rPr>
+        <w:t xml:space="preserve">　导师助理</w:t>
+      </w:r>
+      <w:r>
+        <w:rPr>
+          <w:rFonts w:ascii="Calibri" w:hAnsi="Calibri" w:eastAsia="微软雅黑"/>
+          <w:b w:val="0"/>
+          <w:color w:val="6B6B6B"/>
+          <w:sz w:val="18"/>
+        </w:rPr>
+        <w:tab/>
+        <w:t>2018.10 – 2019.10</w:t>
+      </w:r>
+    </w:p>
+    <w:p>
+      <w:pPr>
+        <w:keepNext/>
+        <w:keepLines/>
+        <w:tabs>
+          <w:tab w:pos="227" w:val="left"/>
+        </w:tabs>
+        <w:spacing w:before="0" w:after="60" w:line="312" w:lineRule="auto"/>
+        <w:ind w:left="227" w:hanging="227"/>
       </w:pPr>
       <w:r>
         <w:rPr>
           <w:rFonts w:ascii="Calibri" w:hAnsi="Calibri" w:eastAsia="微软雅黑"/>
           <w:b w:val="0"/>
-          <w:i w:val="0"/>
-          <w:color w:val="1F4E79"/>
-          <w:sz w:val="20"/>
+          <w:color w:val="2B4A6F"/>
+          <w:sz w:val="19"/>
+        </w:rPr>
+        <w:t>•</w:t>
+        <w:tab/>
+      </w:r>
+      <w:r>
+        <w:rPr>
+          <w:rFonts w:ascii="Calibri" w:hAnsi="Calibri" w:eastAsia="微软雅黑"/>
+          <w:b w:val="0"/>
+          <w:color w:val="262626"/>
+          <w:sz w:val="19"/>
+        </w:rPr>
+        <w:t>对接医院决策层收集战略目标与竞争格局信息；研究口腔行业政策、技术与商业模式动态。</w:t>
+      </w:r>
+    </w:p>
+    <w:p>
+      <w:pPr>
+        <w:keepLines/>
+        <w:tabs>
+          <w:tab w:pos="227" w:val="left"/>
+        </w:tabs>
+        <w:spacing w:before="0" w:after="60" w:line="312" w:lineRule="auto"/>
+        <w:ind w:left="227" w:hanging="227"/>
+      </w:pPr>
+      <w:r>
+        <w:rPr>
+          <w:rFonts w:ascii="Calibri" w:hAnsi="Calibri" w:eastAsia="微软雅黑"/>
+          <w:b w:val="0"/>
+          <w:color w:val="2B4A6F"/>
+          <w:sz w:val="19"/>
+        </w:rPr>
+        <w:t>•</w:t>
+        <w:tab/>
+      </w:r>
+      <w:r>
+        <w:rPr>
+          <w:rFonts w:ascii="Calibri" w:hAnsi="Calibri" w:eastAsia="微软雅黑"/>
+          <w:b w:val="0"/>
+          <w:color w:val="262626"/>
+          <w:sz w:val="19"/>
+        </w:rPr>
+        <w:t>对比竞品价目、测算人均业绩与人员饱和度，搭建盈亏平衡与客流分析表；完成 SWOT 分析与患者就诊流程调研，提出优化建议。</w:t>
+      </w:r>
+    </w:p>
+    <w:p>
+      <w:pPr>
+        <w:spacing w:before="240" w:after="100" w:line="240" w:lineRule="auto"/>
+        <w:keepNext/>
+        <w:pBdr>
+          <w:bottom w:val="single" w:sz="6" w:space="3" w:color="C9D3DE"/>
+        </w:pBdr>
+      </w:pPr>
+      <w:r>
+        <w:rPr>
+          <w:rFonts w:ascii="Calibri" w:hAnsi="Calibri" w:eastAsia="微软雅黑"/>
+          <w:b/>
+          <w:color w:val="2B4A6F"/>
+          <w:sz w:val="23"/>
+        </w:rPr>
+        <w:t>论文与课题</w:t>
+      </w:r>
+    </w:p>
+    <w:p>
+      <w:pPr>
+        <w:keepLines/>
+        <w:tabs>
+          <w:tab w:pos="227" w:val="left"/>
+        </w:tabs>
+        <w:spacing w:before="0" w:after="60" w:line="312" w:lineRule="auto"/>
+        <w:ind w:left="227" w:hanging="227"/>
+      </w:pPr>
+      <w:r>
+        <w:rPr>
+          <w:rFonts w:ascii="Calibri" w:hAnsi="Calibri" w:eastAsia="微软雅黑"/>
+          <w:b w:val="0"/>
+          <w:color w:val="2B4A6F"/>
+          <w:sz w:val="18"/>
+        </w:rPr>
+        <w:t>•</w:t>
+        <w:tab/>
+      </w:r>
+      <w:r>
+        <w:rPr>
+          <w:rFonts w:ascii="Calibri" w:hAnsi="Calibri" w:eastAsia="微软雅黑"/>
+          <w:b w:val="0"/>
+          <w:color w:val="262626"/>
+          <w:sz w:val="18"/>
+        </w:rPr>
+        <w:t>《中医药内容营销对消费意愿的影响机制：形而上与形而下内容的双路径作用》，《商场现代化》，2026（校级课题成果）。</w:t>
+      </w:r>
+    </w:p>
+    <w:p>
+      <w:pPr>
+        <w:keepLines/>
+        <w:tabs>
+          <w:tab w:pos="227" w:val="left"/>
+        </w:tabs>
+        <w:spacing w:before="0" w:after="60" w:line="312" w:lineRule="auto"/>
+        <w:ind w:left="227" w:hanging="227"/>
+      </w:pPr>
+      <w:r>
+        <w:rPr>
+          <w:rFonts w:ascii="Calibri" w:hAnsi="Calibri" w:eastAsia="微软雅黑"/>
+          <w:b w:val="0"/>
+          <w:color w:val="2B4A6F"/>
+          <w:sz w:val="18"/>
+        </w:rPr>
+        <w:t>•</w:t>
+        <w:tab/>
+      </w:r>
+      <w:r>
+        <w:rPr>
+          <w:rFonts w:ascii="Calibri" w:hAnsi="Calibri" w:eastAsia="微软雅黑"/>
+          <w:b w:val="0"/>
+          <w:color w:val="262626"/>
+          <w:sz w:val="18"/>
+        </w:rPr>
+        <w:t>《透视直播电商解读营销的流变与永恒》，广东省社科联 2020 年岭南学术论坛会议论文，获评优秀论文。</w:t>
+      </w:r>
+    </w:p>
+    <w:p>
+      <w:pPr>
+        <w:keepLines/>
+        <w:tabs>
+          <w:tab w:pos="227" w:val="left"/>
+        </w:tabs>
+        <w:spacing w:before="0" w:after="60" w:line="312" w:lineRule="auto"/>
+        <w:ind w:left="227" w:hanging="227"/>
+      </w:pPr>
+      <w:r>
+        <w:rPr>
+          <w:rFonts w:ascii="Calibri" w:hAnsi="Calibri" w:eastAsia="微软雅黑"/>
+          <w:b w:val="0"/>
+          <w:color w:val="2B4A6F"/>
+          <w:sz w:val="18"/>
+        </w:rPr>
+        <w:t>•</w:t>
+        <w:tab/>
+      </w:r>
+      <w:r>
+        <w:rPr>
+          <w:rFonts w:ascii="Calibri" w:hAnsi="Calibri" w:eastAsia="微软雅黑"/>
+          <w:b w:val="0"/>
+          <w:color w:val="262626"/>
+          <w:sz w:val="18"/>
+        </w:rPr>
+        <w:t>《国产动漫火爆，动漫 IP 如何打动消费者》，《国际品牌观察》，2020。</w:t>
+      </w:r>
+    </w:p>
+    <w:p>
+      <w:pPr>
+        <w:spacing w:before="240" w:after="100" w:line="240" w:lineRule="auto"/>
+        <w:keepNext/>
+        <w:pBdr>
+          <w:bottom w:val="single" w:sz="6" w:space="3" w:color="C9D3DE"/>
+        </w:pBdr>
+      </w:pPr>
+      <w:r>
+        <w:rPr>
+          <w:rFonts w:ascii="Calibri" w:hAnsi="Calibri" w:eastAsia="微软雅黑"/>
+          <w:b/>
+          <w:color w:val="2B4A6F"/>
+          <w:sz w:val="23"/>
+        </w:rPr>
+        <w:t>技能</w:t>
+      </w:r>
+    </w:p>
+    <w:p>
+      <w:pPr>
+        <w:keepLines/>
+        <w:tabs>
+          <w:tab w:pos="227" w:val="left"/>
+        </w:tabs>
+        <w:spacing w:before="0" w:after="60" w:line="312" w:lineRule="auto"/>
+        <w:ind w:left="227" w:hanging="227"/>
+      </w:pPr>
+      <w:r>
+        <w:rPr>
+          <w:rFonts w:ascii="Calibri" w:hAnsi="Calibri" w:eastAsia="微软雅黑"/>
+          <w:b w:val="0"/>
+          <w:color w:val="2B4A6F"/>
+          <w:sz w:val="19"/>
         </w:rPr>
         <w:t>•</w:t>
         <w:tab/>
@@ -1447,36 +1271,36 @@
         <w:rPr>
           <w:rFonts w:ascii="Calibri" w:hAnsi="Calibri" w:eastAsia="微软雅黑"/>
           <w:b/>
-          <w:i w:val="0"/>
-          <w:sz w:val="20"/>
+          <w:color w:val="262626"/>
+          <w:sz w:val="19"/>
         </w:rPr>
-        <w:t>AI 工具：</w:t>
+        <w:t xml:space="preserve">AI 工具　</w:t>
       </w:r>
       <w:r>
         <w:rPr>
           <w:rFonts w:ascii="Calibri" w:hAnsi="Calibri" w:eastAsia="微软雅黑"/>
           <w:b w:val="0"/>
-          <w:i w:val="0"/>
-          <w:sz w:val="20"/>
+          <w:color w:val="262626"/>
+          <w:sz w:val="19"/>
         </w:rPr>
-        <w:t>熟练使用 Claude、OpenAI Codex、Cursor、WorkBuddy 等 AI 助手与 Agent 工具，日常用于行业研究与客户洞察、销售方案与行业解决方案撰写、数据分析及办公自动化提效；持续关注 AI 在企业服务场景的落地方式。</w:t>
+        <w:t>Claude、Cursor、OpenAI Codex、WorkBuddy，用于行业研究、方案撰写与数据整理。</w:t>
       </w:r>
     </w:p>
     <w:p>
       <w:pPr>
+        <w:keepLines/>
         <w:tabs>
-          <w:tab w:pos="255" w:val="left"/>
+          <w:tab w:pos="227" w:val="left"/>
         </w:tabs>
-        <w:spacing w:before="0" w:after="30" w:line="288" w:lineRule="auto"/>
-        <w:ind w:left="255" w:hanging="255"/>
+        <w:spacing w:before="0" w:after="60" w:line="312" w:lineRule="auto"/>
+        <w:ind w:left="227" w:hanging="227"/>
       </w:pPr>
       <w:r>
         <w:rPr>
           <w:rFonts w:ascii="Calibri" w:hAnsi="Calibri" w:eastAsia="微软雅黑"/>
           <w:b w:val="0"/>
-          <w:i w:val="0"/>
-          <w:color w:val="1F4E79"/>
-          <w:sz w:val="20"/>
+          <w:color w:val="2B4A6F"/>
+          <w:sz w:val="19"/>
         </w:rPr>
         <w:t>•</w:t>
         <w:tab/>
@@ -1485,36 +1309,36 @@
         <w:rPr>
           <w:rFonts w:ascii="Calibri" w:hAnsi="Calibri" w:eastAsia="微软雅黑"/>
           <w:b/>
-          <w:i w:val="0"/>
-          <w:sz w:val="20"/>
+          <w:color w:val="262626"/>
+          <w:sz w:val="19"/>
         </w:rPr>
-        <w:t>办公与分析工具：</w:t>
+        <w:t xml:space="preserve">办公与分析　</w:t>
       </w:r>
       <w:r>
         <w:rPr>
           <w:rFonts w:ascii="Calibri" w:hAnsi="Calibri" w:eastAsia="微软雅黑"/>
           <w:b w:val="0"/>
-          <w:i w:val="0"/>
-          <w:sz w:val="20"/>
+          <w:color w:val="262626"/>
+          <w:sz w:val="19"/>
         </w:rPr>
         <w:t>Word / PowerPoint（熟练）、Excel（数据透视表、常用函数）、SPSS、AMOS、Xmind。</w:t>
       </w:r>
     </w:p>
     <w:p>
       <w:pPr>
+        <w:keepLines/>
         <w:tabs>
-          <w:tab w:pos="255" w:val="left"/>
+          <w:tab w:pos="227" w:val="left"/>
         </w:tabs>
-        <w:spacing w:before="0" w:after="30" w:line="288" w:lineRule="auto"/>
-        <w:ind w:left="255" w:hanging="255"/>
+        <w:spacing w:before="0" w:after="60" w:line="312" w:lineRule="auto"/>
+        <w:ind w:left="227" w:hanging="227"/>
       </w:pPr>
       <w:r>
         <w:rPr>
           <w:rFonts w:ascii="Calibri" w:hAnsi="Calibri" w:eastAsia="微软雅黑"/>
           <w:b w:val="0"/>
-          <w:i w:val="0"/>
-          <w:color w:val="1F4E79"/>
-          <w:sz w:val="20"/>
+          <w:color w:val="2B4A6F"/>
+          <w:sz w:val="19"/>
         </w:rPr>
         <w:t>•</w:t>
         <w:tab/>
@@ -1523,24 +1347,56 @@
         <w:rPr>
           <w:rFonts w:ascii="Calibri" w:hAnsi="Calibri" w:eastAsia="微软雅黑"/>
           <w:b/>
-          <w:i w:val="0"/>
-          <w:sz w:val="20"/>
+          <w:color w:val="262626"/>
+          <w:sz w:val="19"/>
         </w:rPr>
-        <w:t>语言：</w:t>
+        <w:t xml:space="preserve">语言　</w:t>
       </w:r>
       <w:r>
         <w:rPr>
           <w:rFonts w:ascii="Calibri" w:hAnsi="Calibri" w:eastAsia="微软雅黑"/>
           <w:b w:val="0"/>
-          <w:i w:val="0"/>
-          <w:sz w:val="20"/>
+          <w:color w:val="262626"/>
+          <w:sz w:val="19"/>
         </w:rPr>
         <w:t>英语（CET-6、BEC 中级）、粤语（良好）。</w:t>
       </w:r>
     </w:p>
+    <w:p>
+      <w:pPr>
+        <w:spacing w:before="240" w:after="100" w:line="240" w:lineRule="auto"/>
+        <w:keepNext/>
+        <w:pBdr>
+          <w:bottom w:val="single" w:sz="6" w:space="3" w:color="C9D3DE"/>
+        </w:pBdr>
+      </w:pPr>
+      <w:r>
+        <w:rPr>
+          <w:rFonts w:ascii="Calibri" w:hAnsi="Calibri" w:eastAsia="微软雅黑"/>
+          <w:b/>
+          <w:color w:val="2B4A6F"/>
+          <w:sz w:val="23"/>
+        </w:rPr>
+        <w:t>自我评价</w:t>
+      </w:r>
+    </w:p>
+    <w:p>
+      <w:pPr>
+        <w:spacing w:before="0" w:after="0" w:line="312" w:lineRule="auto"/>
+      </w:pPr>
+      <w:r>
+        <w:rPr>
+          <w:rFonts w:ascii="Calibri" w:hAnsi="Calibri" w:eastAsia="微软雅黑"/>
+          <w:b w:val="0"/>
+          <w:color w:val="262626"/>
+          <w:sz w:val="19"/>
+        </w:rPr>
+        <w:t>医药专业出身，从药企市场实习、强生一线销售到高校研究与渠道实战，工作始终围绕医疗健康行业客户展开。希望加入飞书，把对医院、药企、渠道商的理解用于企业服务领域，做长期投入；入职后可全职投入，不再参与合伙业务经营。</w:t>
+      </w:r>
+    </w:p>
     <w:sectPr>
       <w:pgSz w:w="11906" w:h="16838"/>
-      <w:pgMar w:top="794" w:right="964" w:bottom="680" w:left="964" w:header="720" w:footer="720" w:gutter="0"/>
+      <w:pgMar w:top="907" w:right="1077" w:bottom="850" w:left="1077" w:header="720" w:footer="720" w:gutter="0"/>
       <w:cols w:space="720"/>
       <w:docGrid w:linePitch="360"/>
     </w:sectPr>
@@ -1913,7 +1769,7 @@
     <w:rsid w:val="00FC693F"/>
     <w:rPr>
       <w:rFonts w:ascii="Calibri" w:hAnsi="Calibri" w:eastAsia="微软雅黑"/>
-      <w:sz w:val="20"/>
+      <w:sz w:val="19"/>
     </w:rPr>
   </w:style>
   <w:style w:type="paragraph" w:styleId="Header">

</xml_diff>

<commit_message>
Reframe channel venture as a completed project (2024-2026) under project experience
Co-authored-by: nancyx461-art <nancyx461-art@users.noreply.github.com>
</commit_message>
<xml_diff>
--- a/resume/许增楠-医疗健康行业大客户销售-飞书.docx
+++ b/resume/许增楠-医疗健康行业大客户销售-飞书.docx
@@ -339,7 +339,7 @@
           <w:color w:val="262626"/>
           <w:sz w:val="19"/>
         </w:rPr>
-        <w:t>医药方向本科、医药营销方向硕士；强生医疗 1.5 年一线销售，罗氏制药、视源医疗显示实习；2024 年起以合伙人身份参与医疗器械渠道业务，开发 4 家医院、8 个产品入院。</w:t>
+        <w:t>医药方向本科、医药营销方向硕士；强生医疗 1.5 年一线销售，罗氏制药、视源医疗显示实习；2024–2026 年参与医疗器械渠道合作项目，开发 4 家医院、8 个产品入院。</w:t>
       </w:r>
     </w:p>
     <w:p>
@@ -568,132 +568,6 @@
           <w:sz w:val="19"/>
         </w:rPr>
         <w:t>主持校级课题《中医药内容营销对消费意愿的影响机制研究》，成果发表于《商场现代化》（2026）。</w:t>
-      </w:r>
-    </w:p>
-    <w:p>
-      <w:pPr>
-        <w:keepNext/>
-        <w:tabs>
-          <w:tab w:pos="9752" w:val="right"/>
-        </w:tabs>
-        <w:spacing w:before="140" w:after="40" w:line="264" w:lineRule="auto"/>
-      </w:pPr>
-      <w:r>
-        <w:rPr>
-          <w:rFonts w:ascii="Calibri" w:hAnsi="Calibri" w:eastAsia="微软雅黑"/>
-          <w:b/>
-          <w:color w:val="262626"/>
-          <w:sz w:val="21"/>
-        </w:rPr>
-        <w:t>医疗器械渠道业务（与前强生销售经理合伙）</w:t>
-      </w:r>
-      <w:r>
-        <w:rPr>
-          <w:rFonts w:ascii="Calibri" w:hAnsi="Calibri" w:eastAsia="微软雅黑"/>
-          <w:b w:val="0"/>
-          <w:color w:val="6B6B6B"/>
-          <w:sz w:val="19"/>
-        </w:rPr>
-        <w:t xml:space="preserve">　合伙人（兼职）</w:t>
-      </w:r>
-      <w:r>
-        <w:rPr>
-          <w:rFonts w:ascii="Calibri" w:hAnsi="Calibri" w:eastAsia="微软雅黑"/>
-          <w:b w:val="0"/>
-          <w:color w:val="6B6B6B"/>
-          <w:sz w:val="18"/>
-        </w:rPr>
-        <w:tab/>
-        <w:t>2024 – 至今　广州</w:t>
-      </w:r>
-    </w:p>
-    <w:p>
-      <w:pPr>
-        <w:keepNext/>
-        <w:keepLines/>
-        <w:tabs>
-          <w:tab w:pos="227" w:val="left"/>
-        </w:tabs>
-        <w:spacing w:before="0" w:after="60" w:line="312" w:lineRule="auto"/>
-        <w:ind w:left="227" w:hanging="227"/>
-      </w:pPr>
-      <w:r>
-        <w:rPr>
-          <w:rFonts w:ascii="Calibri" w:hAnsi="Calibri" w:eastAsia="微软雅黑"/>
-          <w:b w:val="0"/>
-          <w:color w:val="2B4A6F"/>
-          <w:sz w:val="19"/>
-        </w:rPr>
-        <w:t>•</w:t>
-        <w:tab/>
-      </w:r>
-      <w:r>
-        <w:rPr>
-          <w:rFonts w:ascii="Calibri" w:hAnsi="Calibri" w:eastAsia="微软雅黑"/>
-          <w:b w:val="0"/>
-          <w:color w:val="262626"/>
-          <w:sz w:val="19"/>
-        </w:rPr>
-        <w:t>负责新医院开发：对接副院长、科主任等决策人，完成 4 家医院准入、8 个产品入院。</w:t>
-      </w:r>
-    </w:p>
-    <w:p>
-      <w:pPr>
-        <w:keepNext/>
-        <w:keepLines/>
-        <w:tabs>
-          <w:tab w:pos="227" w:val="left"/>
-        </w:tabs>
-        <w:spacing w:before="0" w:after="60" w:line="312" w:lineRule="auto"/>
-        <w:ind w:left="227" w:hanging="227"/>
-      </w:pPr>
-      <w:r>
-        <w:rPr>
-          <w:rFonts w:ascii="Calibri" w:hAnsi="Calibri" w:eastAsia="微软雅黑"/>
-          <w:b w:val="0"/>
-          <w:color w:val="2B4A6F"/>
-          <w:sz w:val="19"/>
-        </w:rPr>
-        <w:t>•</w:t>
-        <w:tab/>
-      </w:r>
-      <w:r>
-        <w:rPr>
-          <w:rFonts w:ascii="Calibri" w:hAnsi="Calibri" w:eastAsia="微软雅黑"/>
-          <w:b w:val="0"/>
-          <w:color w:val="262626"/>
-          <w:sz w:val="19"/>
-        </w:rPr>
-        <w:t>跨境医疗项目：带领团队与 4 家私立医院洽谈合作，建立 5 家合作渠道商。</w:t>
-      </w:r>
-    </w:p>
-    <w:p>
-      <w:pPr>
-        <w:keepLines/>
-        <w:tabs>
-          <w:tab w:pos="227" w:val="left"/>
-        </w:tabs>
-        <w:spacing w:before="0" w:after="60" w:line="312" w:lineRule="auto"/>
-        <w:ind w:left="227" w:hanging="227"/>
-      </w:pPr>
-      <w:r>
-        <w:rPr>
-          <w:rFonts w:ascii="Calibri" w:hAnsi="Calibri" w:eastAsia="微软雅黑"/>
-          <w:b w:val="0"/>
-          <w:color w:val="2B4A6F"/>
-          <w:sz w:val="19"/>
-        </w:rPr>
-        <w:t>•</w:t>
-        <w:tab/>
-      </w:r>
-      <w:r>
-        <w:rPr>
-          <w:rFonts w:ascii="Calibri" w:hAnsi="Calibri" w:eastAsia="微软雅黑"/>
-          <w:b w:val="0"/>
-          <w:color w:val="262626"/>
-          <w:sz w:val="19"/>
-        </w:rPr>
-        <w:t>以渠道商身份参与经营，理解渠道商的经营逻辑与合作诉求。</w:t>
       </w:r>
     </w:p>
     <w:p>
@@ -1027,6 +901,132 @@
           <w:sz w:val="23"/>
         </w:rPr>
         <w:t>项目经历</w:t>
+      </w:r>
+    </w:p>
+    <w:p>
+      <w:pPr>
+        <w:keepNext/>
+        <w:tabs>
+          <w:tab w:pos="9752" w:val="right"/>
+        </w:tabs>
+        <w:spacing w:before="140" w:after="40" w:line="264" w:lineRule="auto"/>
+      </w:pPr>
+      <w:r>
+        <w:rPr>
+          <w:rFonts w:ascii="Calibri" w:hAnsi="Calibri" w:eastAsia="微软雅黑"/>
+          <w:b/>
+          <w:color w:val="262626"/>
+          <w:sz w:val="21"/>
+        </w:rPr>
+        <w:t>医疗器械渠道合作项目（与前强生销售经理合作）</w:t>
+      </w:r>
+      <w:r>
+        <w:rPr>
+          <w:rFonts w:ascii="Calibri" w:hAnsi="Calibri" w:eastAsia="微软雅黑"/>
+          <w:b w:val="0"/>
+          <w:color w:val="6B6B6B"/>
+          <w:sz w:val="19"/>
+        </w:rPr>
+        <w:t xml:space="preserve">　负责医院开发与渠道合作</w:t>
+      </w:r>
+      <w:r>
+        <w:rPr>
+          <w:rFonts w:ascii="Calibri" w:hAnsi="Calibri" w:eastAsia="微软雅黑"/>
+          <w:b w:val="0"/>
+          <w:color w:val="6B6B6B"/>
+          <w:sz w:val="18"/>
+        </w:rPr>
+        <w:tab/>
+        <w:t>2024 – 2026　广州</w:t>
+      </w:r>
+    </w:p>
+    <w:p>
+      <w:pPr>
+        <w:keepNext/>
+        <w:keepLines/>
+        <w:tabs>
+          <w:tab w:pos="227" w:val="left"/>
+        </w:tabs>
+        <w:spacing w:before="0" w:after="60" w:line="312" w:lineRule="auto"/>
+        <w:ind w:left="227" w:hanging="227"/>
+      </w:pPr>
+      <w:r>
+        <w:rPr>
+          <w:rFonts w:ascii="Calibri" w:hAnsi="Calibri" w:eastAsia="微软雅黑"/>
+          <w:b w:val="0"/>
+          <w:color w:val="2B4A6F"/>
+          <w:sz w:val="19"/>
+        </w:rPr>
+        <w:t>•</w:t>
+        <w:tab/>
+      </w:r>
+      <w:r>
+        <w:rPr>
+          <w:rFonts w:ascii="Calibri" w:hAnsi="Calibri" w:eastAsia="微软雅黑"/>
+          <w:b w:val="0"/>
+          <w:color w:val="262626"/>
+          <w:sz w:val="19"/>
+        </w:rPr>
+        <w:t>新医院开发：对接副院长、科主任等决策人，完成 4 家医院准入、8 个产品入院。</w:t>
+      </w:r>
+    </w:p>
+    <w:p>
+      <w:pPr>
+        <w:keepNext/>
+        <w:keepLines/>
+        <w:tabs>
+          <w:tab w:pos="227" w:val="left"/>
+        </w:tabs>
+        <w:spacing w:before="0" w:after="60" w:line="312" w:lineRule="auto"/>
+        <w:ind w:left="227" w:hanging="227"/>
+      </w:pPr>
+      <w:r>
+        <w:rPr>
+          <w:rFonts w:ascii="Calibri" w:hAnsi="Calibri" w:eastAsia="微软雅黑"/>
+          <w:b w:val="0"/>
+          <w:color w:val="2B4A6F"/>
+          <w:sz w:val="19"/>
+        </w:rPr>
+        <w:t>•</w:t>
+        <w:tab/>
+      </w:r>
+      <w:r>
+        <w:rPr>
+          <w:rFonts w:ascii="Calibri" w:hAnsi="Calibri" w:eastAsia="微软雅黑"/>
+          <w:b w:val="0"/>
+          <w:color w:val="262626"/>
+          <w:sz w:val="19"/>
+        </w:rPr>
+        <w:t>跨境医疗项目：带领团队与 4 家私立医院洽谈合作，建立 5 家合作渠道商。</w:t>
+      </w:r>
+    </w:p>
+    <w:p>
+      <w:pPr>
+        <w:keepLines/>
+        <w:tabs>
+          <w:tab w:pos="227" w:val="left"/>
+        </w:tabs>
+        <w:spacing w:before="0" w:after="60" w:line="312" w:lineRule="auto"/>
+        <w:ind w:left="227" w:hanging="227"/>
+      </w:pPr>
+      <w:r>
+        <w:rPr>
+          <w:rFonts w:ascii="Calibri" w:hAnsi="Calibri" w:eastAsia="微软雅黑"/>
+          <w:b w:val="0"/>
+          <w:color w:val="2B4A6F"/>
+          <w:sz w:val="19"/>
+        </w:rPr>
+        <w:t>•</w:t>
+        <w:tab/>
+      </w:r>
+      <w:r>
+        <w:rPr>
+          <w:rFonts w:ascii="Calibri" w:hAnsi="Calibri" w:eastAsia="微软雅黑"/>
+          <w:b w:val="0"/>
+          <w:color w:val="262626"/>
+          <w:sz w:val="19"/>
+        </w:rPr>
+        <w:t>从渠道商角度参与经营决策，理解渠道商的经营逻辑与合作诉求；项目已于 2026 年完成交接。</w:t>
       </w:r>
     </w:p>
     <w:p>
@@ -1391,7 +1391,7 @@
           <w:color w:val="262626"/>
           <w:sz w:val="19"/>
         </w:rPr>
-        <w:t>医药专业出身，从药企市场实习、强生一线销售到高校研究与渠道实战，工作始终围绕医疗健康行业客户展开。希望加入飞书，把对医院、药企、渠道商的理解用于企业服务领域，做长期投入；入职后可全职投入，不再参与合伙业务经营。</w:t>
+        <w:t>医药专业出身，从药企市场实习、强生一线销售到高校研究与渠道项目实践，工作始终围绕医疗健康行业客户展开。渠道合作项目已完成交接，不再参与经营，可全职投入；希望加入飞书，把对医院、药企、渠道商的理解用于企业服务领域，做长期投入。</w:t>
       </w:r>
     </w:p>
     <w:sectPr>

</xml_diff>

<commit_message>
Final wording: venture operations handed to partner, keep shareholder-consistent phrasing
Co-authored-by: nancyx461-art <nancyx461-art@users.noreply.github.com>
</commit_message>
<xml_diff>
--- a/resume/许增楠-医疗健康行业大客户销售-飞书.docx
+++ b/resume/许增楠-医疗健康行业大客户销售-飞书.docx
@@ -1026,7 +1026,7 @@
           <w:color w:val="262626"/>
           <w:sz w:val="19"/>
         </w:rPr>
-        <w:t>从渠道商角度参与经营决策，理解渠道商的经营逻辑与合作诉求；项目已于 2026 年完成交接。</w:t>
+        <w:t>从渠道商角度参与经营决策，理解渠道商的经营逻辑与合作诉求；2026 年起日常经营已移交合作伙伴。</w:t>
       </w:r>
     </w:p>
     <w:p>
@@ -1391,7 +1391,7 @@
           <w:color w:val="262626"/>
           <w:sz w:val="19"/>
         </w:rPr>
-        <w:t>医药专业出身，从药企市场实习、强生一线销售到高校研究与渠道项目实践，工作始终围绕医疗健康行业客户展开。渠道合作项目已完成交接，不再参与经营，可全职投入；希望加入飞书，把对医院、药企、渠道商的理解用于企业服务领域，做长期投入。</w:t>
+        <w:t>医药专业出身，从药企市场实习、强生一线销售到高校研究与渠道项目实践，工作始终围绕医疗健康行业客户展开。渠道合作项目的日常经营已移交合作伙伴，本人不再参与经营，可全职投入；希望加入飞书，把对医院、药企、渠道商的理解用于企业服务领域，做长期投入。</w:t>
       </w:r>
     </w:p>
     <w:sectPr>

</xml_diff>

<commit_message>
Correct academic background to business major with medical coursework; drop partner and handover mentions
Co-authored-by: nancyx461-art <nancyx461-art@users.noreply.github.com>
</commit_message>
<xml_diff>
--- a/resume/许增楠-医疗健康行业大客户销售-飞书.docx
+++ b/resume/许增楠-医疗健康行业大客户销售-飞书.docx
@@ -283,7 +283,7 @@
           <w:color w:val="262626"/>
           <w:sz w:val="19"/>
         </w:rPr>
-        <w:t>GPA 3.8，专业排名第 2；修读药理学、西医学概论等医药课程；连续四年获校级奖学金。</w:t>
+        <w:t>GPA 3.8，专业排名第 2；系统修读解剖学、药理学、西医学概论等医学基础课程；连续四年获校级奖学金。</w:t>
       </w:r>
     </w:p>
     <w:p>
@@ -339,7 +339,7 @@
           <w:color w:val="262626"/>
           <w:sz w:val="19"/>
         </w:rPr>
-        <w:t>医药方向本科、医药营销方向硕士；强生医疗 1.5 年一线销售，罗氏制药、视源医疗显示实习；2024–2026 年参与医疗器械渠道合作项目，开发 4 家医院、8 个产品入院。</w:t>
+        <w:t>经管类专业出身，本科系统修读解剖学、药理学等医学基础课程，硕士研究方向为医药营销；强生医疗 1.5 年一线销售，罗氏制药、视源医疗显示实习，2024–2026 年参与医疗器械渠道项目，开发 4 家医院、8 个产品入院。</w:t>
       </w:r>
     </w:p>
     <w:p>
@@ -415,7 +415,7 @@
           <w:color w:val="262626"/>
           <w:sz w:val="19"/>
         </w:rPr>
-        <w:t>主讲数字营销、营销渠道管理课程，主持医药内容营销课题并发表论文；曾负责卫星会与科室会宣讲，能独立完成行业分析并清晰讲解。</w:t>
+        <w:t>教学与研究均聚焦医疗健康与营销的交叉：主讲数字营销、营销渠道管理课程，主持医药内容营销课题并发表论文；曾负责卫星会与科室会宣讲，能独立完成行业分析并清晰讲解。</w:t>
       </w:r>
     </w:p>
     <w:p>
@@ -918,7 +918,7 @@
           <w:color w:val="262626"/>
           <w:sz w:val="21"/>
         </w:rPr>
-        <w:t>医疗器械渠道合作项目（与前强生销售经理合作）</w:t>
+        <w:t>医疗器械渠道合作项目</w:t>
       </w:r>
       <w:r>
         <w:rPr>
@@ -1026,7 +1026,7 @@
           <w:color w:val="262626"/>
           <w:sz w:val="19"/>
         </w:rPr>
-        <w:t>从渠道商角度参与经营决策，理解渠道商的经营逻辑与合作诉求；2026 年起日常经营已移交合作伙伴。</w:t>
+        <w:t>从渠道商角度参与经营决策，理解渠道商的经营逻辑与合作诉求。</w:t>
       </w:r>
     </w:p>
     <w:p>
@@ -1391,7 +1391,7 @@
           <w:color w:val="262626"/>
           <w:sz w:val="19"/>
         </w:rPr>
-        <w:t>医药专业出身，从药企市场实习、强生一线销售到高校研究与渠道项目实践，工作始终围绕医疗健康行业客户展开。渠道合作项目的日常经营已移交合作伙伴，本人不再参与经营，可全职投入；希望加入飞书，把对医院、药企、渠道商的理解用于企业服务领域，做长期投入。</w:t>
+        <w:t>经管类专业出身，本科阶段系统修读医学基础课程，硕士聚焦医药营销；从药企市场实习、强生一线销售到高校教学与渠道项目实践，始终围绕医疗健康与营销两个方向积累。希望加入飞书，把对医院、药企、渠道商的理解用于企业服务领域，做长期投入。</w:t>
       </w:r>
     </w:p>
     <w:sectPr>

</xml_diff>

<commit_message>
Attribute anatomy and surgical technique training to J&J onboarding, not undergraduate coursework
Co-authored-by: nancyx461-art <nancyx461-art@users.noreply.github.com>
</commit_message>
<xml_diff>
--- a/resume/许增楠-医疗健康行业大客户销售-飞书.docx
+++ b/resume/许增楠-医疗健康行业大客户销售-飞书.docx
@@ -283,7 +283,7 @@
           <w:color w:val="262626"/>
           <w:sz w:val="19"/>
         </w:rPr>
-        <w:t>GPA 3.8，专业排名第 2；系统修读解剖学、药理学、西医学概论等医学基础课程；连续四年获校级奖学金。</w:t>
+        <w:t>GPA 3.8，专业排名第 2；修读药理学、西医学概论等医学课程；连续四年获校级奖学金。</w:t>
       </w:r>
     </w:p>
     <w:p>
@@ -339,7 +339,7 @@
           <w:color w:val="262626"/>
           <w:sz w:val="19"/>
         </w:rPr>
-        <w:t>经管类专业出身，本科系统修读解剖学、药理学等医学基础课程，硕士研究方向为医药营销；强生医疗 1.5 年一线销售，罗氏制药、视源医疗显示实习，2024–2026 年参与医疗器械渠道项目，开发 4 家医院、8 个产品入院。</w:t>
+        <w:t>经管类专业出身，本科修读药理学、西医学概论等医学课程，硕士研究方向为医药营销，强生入职培训系统学习解剖学与手术术式；强生医疗 1.5 年一线销售，罗氏制药、视源医疗显示实习，2024–2026 年参与医疗器械渠道项目，开发 4 家医院、8 个产品入院。</w:t>
       </w:r>
     </w:p>
     <w:p>
@@ -721,6 +721,35 @@
           <w:sz w:val="19"/>
         </w:rPr>
         <w:t>学术活动与跨部门协作：策划并落地 10+ 场学术活动（单场最高 40 万元）；配合市场部推进白皮书、手术指南编写；负责卫星会及科室会宣讲。</w:t>
+      </w:r>
+    </w:p>
+    <w:p>
+      <w:pPr>
+        <w:keepLines/>
+        <w:tabs>
+          <w:tab w:pos="227" w:val="left"/>
+        </w:tabs>
+        <w:spacing w:before="0" w:after="60" w:line="312" w:lineRule="auto"/>
+        <w:ind w:left="227" w:hanging="227"/>
+      </w:pPr>
+      <w:r>
+        <w:rPr>
+          <w:rFonts w:ascii="Calibri" w:hAnsi="Calibri" w:eastAsia="微软雅黑"/>
+          <w:b w:val="0"/>
+          <w:color w:val="2B4A6F"/>
+          <w:sz w:val="19"/>
+        </w:rPr>
+        <w:t>•</w:t>
+        <w:tab/>
+      </w:r>
+      <w:r>
+        <w:rPr>
+          <w:rFonts w:ascii="Calibri" w:hAnsi="Calibri" w:eastAsia="微软雅黑"/>
+          <w:b w:val="0"/>
+          <w:color w:val="262626"/>
+          <w:sz w:val="19"/>
+        </w:rPr>
+        <w:t>专业知识：入职培训系统学习解剖学与相关手术术式，能够与临床专家就产品应用场景进行专业沟通。</w:t>
       </w:r>
     </w:p>
     <w:p>
@@ -1391,7 +1420,7 @@
           <w:color w:val="262626"/>
           <w:sz w:val="19"/>
         </w:rPr>
-        <w:t>经管类专业出身，本科阶段系统修读医学基础课程，硕士聚焦医药营销；从药企市场实习、强生一线销售到高校教学与渠道项目实践，始终围绕医疗健康与营销两个方向积累。希望加入飞书，把对医院、药企、渠道商的理解用于企业服务领域，做长期投入。</w:t>
+        <w:t>经管类专业出身，本科修读医学基础课程，硕士聚焦医药营销；从药企市场实习、强生一线销售到高校教学与渠道项目实践，始终围绕医疗健康与营销两个方向积累。希望加入飞书，把对医院、药企、渠道商的理解用于企业服务领域，做长期投入。</w:t>
       </w:r>
     </w:p>
     <w:sectPr>

</xml_diff>

<commit_message>
Correct channel project start date to 2025.02
Co-authored-by: nancyx461-art <nancyx461-art@users.noreply.github.com>
</commit_message>
<xml_diff>
--- a/resume/许增楠-医疗健康行业大客户销售-飞书.docx
+++ b/resume/许增楠-医疗健康行业大客户销售-飞书.docx
@@ -339,7 +339,7 @@
           <w:color w:val="262626"/>
           <w:sz w:val="19"/>
         </w:rPr>
-        <w:t>经管类专业出身，本科修读药理学、西医学概论等医学课程，硕士研究方向为医药营销，强生入职培训系统学习解剖学与手术术式；强生医疗 1.5 年一线销售，罗氏制药、视源医疗显示实习，2024–2026 年参与医疗器械渠道项目，开发 4 家医院、8 个产品入院。</w:t>
+        <w:t>经管类专业出身，本科修读药理学、西医学概论等医学课程，硕士研究方向为医药营销，强生入职培训系统学习解剖学与手术术式；强生医疗 1.5 年一线销售，罗氏制药、视源医疗显示实习，2025–2026 年参与医疗器械渠道项目，开发 4 家医院、8 个产品入院。</w:t>
       </w:r>
     </w:p>
     <w:p>
@@ -966,7 +966,7 @@
           <w:sz w:val="18"/>
         </w:rPr>
         <w:tab/>
-        <w:t>2024 – 2026　广州</w:t>
+        <w:t>2025.02 – 2026　广州</w:t>
       </w:r>
     </w:p>
     <w:p>

</xml_diff>

<commit_message>
Add Strategic Management to taught courses
Co-authored-by: nancyx461-art <nancyx461-art@users.noreply.github.com>
</commit_message>
<xml_diff>
--- a/resume/许增楠-医疗健康行业大客户销售-飞书.docx
+++ b/resume/许增楠-医疗健康行业大客户销售-飞书.docx
@@ -415,7 +415,7 @@
           <w:color w:val="262626"/>
           <w:sz w:val="19"/>
         </w:rPr>
-        <w:t>教学与研究均聚焦医疗健康与营销的交叉：主讲数字营销、营销渠道管理课程，主持医药内容营销课题并发表论文；曾负责卫星会与科室会宣讲，能独立完成行业分析并清晰讲解。</w:t>
+        <w:t>教学与研究均聚焦医疗健康与营销的交叉：主讲数字营销、营销渠道管理、战略管理课程，主持医药内容营销课题并发表论文；曾负责卫星会与科室会宣讲，能独立完成行业分析并清晰讲解。</w:t>
       </w:r>
     </w:p>
     <w:p>
@@ -538,7 +538,7 @@
           <w:color w:val="262626"/>
           <w:sz w:val="19"/>
         </w:rPr>
-        <w:t>主讲《数字营销》《营销渠道管理》《电子商务原理》课程，负责课程设计与学生指导。</w:t>
+        <w:t>主讲《数字营销》《营销渠道管理》《战略管理》《电子商务原理》课程，负责课程设计与学生指导。</w:t>
       </w:r>
     </w:p>
     <w:p>

</xml_diff>

<commit_message>
Add TCM pharmacology coursework; tighten healthcare-marketing through-line
Co-authored-by: nancyx461-art <nancyx461-art@users.noreply.github.com>
</commit_message>
<xml_diff>
--- a/resume/许增楠-医疗健康行业大客户销售-飞书.docx
+++ b/resume/许增楠-医疗健康行业大客户销售-飞书.docx
@@ -283,7 +283,7 @@
           <w:color w:val="262626"/>
           <w:sz w:val="19"/>
         </w:rPr>
-        <w:t>GPA 3.8，专业排名第 2；修读药理学、西医学概论等医学课程；连续四年获校级奖学金。</w:t>
+        <w:t>GPA 3.8，专业排名第 2；修读中药学、药理学、西医学概论等医药课程；连续四年获校级奖学金。</w:t>
       </w:r>
     </w:p>
     <w:p>
@@ -339,7 +339,7 @@
           <w:color w:val="262626"/>
           <w:sz w:val="19"/>
         </w:rPr>
-        <w:t>经管类专业出身，本科修读药理学、西医学概论等医学课程，硕士研究方向为医药营销，强生入职培训系统学习解剖学与手术术式；强生医疗 1.5 年一线销售，罗氏制药、视源医疗显示实习，2025–2026 年参与医疗器械渠道项目，开发 4 家医院、8 个产品入院。</w:t>
+        <w:t>经管类专业出身，本科修读中药学、药理学、西医学概论等医药课程，硕士研究方向为医药营销，强生入职培训系统学习解剖学与手术术式；强生医疗 1.5 年一线销售，罗氏制药、视源医疗显示实习，2025–2026 年参与医疗器械渠道项目，开发 4 家医院、8 个产品入院。</w:t>
       </w:r>
     </w:p>
     <w:p>

</xml_diff>